<commit_message>
Add phase 2 weakness classification
</commit_message>
<xml_diff>
--- a/report/SECJ3483-01_Izzat_Ammar_Rami_Nour.docx
+++ b/report/SECJ3483-01_Izzat_Ammar_Rami_Nour.docx
@@ -38,12 +38,12 @@
           <wp:inline distB="114300" distT="114300" distL="114300" distR="114300">
             <wp:extent cx="4338638" cy="1421278"/>
             <wp:effectExtent b="0" l="0" r="0" t="0"/>
-            <wp:docPr id="10" name="image8.png"/>
+            <wp:docPr id="10" name="image11.png"/>
             <a:graphic>
               <a:graphicData uri="http://schemas.openxmlformats.org/drawingml/2006/picture">
                 <pic:pic>
                   <pic:nvPicPr>
-                    <pic:cNvPr id="0" name="image8.png"/>
+                    <pic:cNvPr id="0" name="image11.png"/>
                     <pic:cNvPicPr preferRelativeResize="0"/>
                   </pic:nvPicPr>
                   <pic:blipFill>
@@ -781,12 +781,18 @@
         <w:jc w:val="left"/>
         <w:rPr>
           <w:rFonts w:ascii="Times New Roman" w:cs="Times New Roman" w:eastAsia="Times New Roman" w:hAnsi="Times New Roman"/>
+          <w:b w:val="1"/>
+          <w:bCs w:val="1"/>
         </w:rPr>
       </w:pPr>
       <w:r>
         <w:rPr>
+          <w:rFonts w:ascii="Times New Roman" w:cs="Times New Roman" w:eastAsia="Times New Roman" w:hAnsi="Times New Roman"/>
+          <w:b w:val="1"/>
+          <w:bCs w:val="1"/>
           <w:rtl w:val="0"/>
         </w:rPr>
+        <w:t xml:space="preserve">Phase 1</w:t>
       </w:r>
     </w:p>
     <w:p>
@@ -3541,12 +3547,12 @@
                 <wp:inline distB="114300" distT="114300" distL="114300" distR="114300">
                   <wp:extent cx="2519363" cy="1548525"/>
                   <wp:effectExtent b="0" l="0" r="0" t="0"/>
-                  <wp:docPr id="2" name="image5.png"/>
+                  <wp:docPr id="2" name="image3.png"/>
                   <a:graphic>
                     <a:graphicData uri="http://schemas.openxmlformats.org/drawingml/2006/picture">
                       <pic:pic>
                         <pic:nvPicPr>
-                          <pic:cNvPr id="0" name="image5.png"/>
+                          <pic:cNvPr id="0" name="image3.png"/>
                           <pic:cNvPicPr preferRelativeResize="0"/>
                         </pic:nvPicPr>
                         <pic:blipFill>
@@ -3578,12 +3584,12 @@
                 <wp:inline distB="114300" distT="114300" distL="114300" distR="114300">
                   <wp:extent cx="2114550" cy="1728788"/>
                   <wp:effectExtent b="0" l="0" r="0" t="0"/>
-                  <wp:docPr id="11" name="image7.png"/>
+                  <wp:docPr id="11" name="image6.png"/>
                   <a:graphic>
                     <a:graphicData uri="http://schemas.openxmlformats.org/drawingml/2006/picture">
                       <pic:pic>
                         <pic:nvPicPr>
-                          <pic:cNvPr id="0" name="image7.png"/>
+                          <pic:cNvPr id="0" name="image6.png"/>
                           <pic:cNvPicPr preferRelativeResize="0"/>
                         </pic:nvPicPr>
                         <pic:blipFill>
@@ -3701,12 +3707,12 @@
                 <wp:inline distB="114300" distT="114300" distL="114300" distR="114300">
                   <wp:extent cx="2240833" cy="1692331"/>
                   <wp:effectExtent b="0" l="0" r="0" t="0"/>
-                  <wp:docPr id="5" name="image6.png"/>
+                  <wp:docPr id="5" name="image1.png"/>
                   <a:graphic>
                     <a:graphicData uri="http://schemas.openxmlformats.org/drawingml/2006/picture">
                       <pic:pic>
                         <pic:nvPicPr>
-                          <pic:cNvPr id="0" name="image6.png"/>
+                          <pic:cNvPr id="0" name="image1.png"/>
                           <pic:cNvPicPr preferRelativeResize="0"/>
                         </pic:nvPicPr>
                         <pic:blipFill>
@@ -3824,12 +3830,12 @@
                 <wp:inline distB="114300" distT="114300" distL="114300" distR="114300">
                   <wp:extent cx="2551655" cy="1804988"/>
                   <wp:effectExtent b="0" l="0" r="0" t="0"/>
-                  <wp:docPr id="6" name="image2.png"/>
+                  <wp:docPr id="6" name="image4.png"/>
                   <a:graphic>
                     <a:graphicData uri="http://schemas.openxmlformats.org/drawingml/2006/picture">
                       <pic:pic>
                         <pic:nvPicPr>
-                          <pic:cNvPr id="0" name="image2.png"/>
+                          <pic:cNvPr id="0" name="image4.png"/>
                           <pic:cNvPicPr preferRelativeResize="0"/>
                         </pic:nvPicPr>
                         <pic:blipFill>
@@ -3947,12 +3953,12 @@
                 <wp:inline distB="114300" distT="114300" distL="114300" distR="114300">
                   <wp:extent cx="3474927" cy="2328863"/>
                   <wp:effectExtent b="0" l="0" r="0" t="0"/>
-                  <wp:docPr id="3" name="image4.png"/>
+                  <wp:docPr id="3" name="image8.png"/>
                   <a:graphic>
                     <a:graphicData uri="http://schemas.openxmlformats.org/drawingml/2006/picture">
                       <pic:pic>
                         <pic:nvPicPr>
-                          <pic:cNvPr id="0" name="image4.png"/>
+                          <pic:cNvPr id="0" name="image8.png"/>
                           <pic:cNvPicPr preferRelativeResize="0"/>
                         </pic:nvPicPr>
                         <pic:blipFill>
@@ -4107,12 +4113,12 @@
                 <wp:inline distB="114300" distT="114300" distL="114300" distR="114300">
                   <wp:extent cx="3033713" cy="2051981"/>
                   <wp:effectExtent b="0" l="0" r="0" t="0"/>
-                  <wp:docPr id="9" name="image3.png"/>
+                  <wp:docPr id="9" name="image10.png"/>
                   <a:graphic>
                     <a:graphicData uri="http://schemas.openxmlformats.org/drawingml/2006/picture">
                       <pic:pic>
                         <pic:nvPicPr>
-                          <pic:cNvPr id="0" name="image3.png"/>
+                          <pic:cNvPr id="0" name="image10.png"/>
                           <pic:cNvPicPr preferRelativeResize="0"/>
                         </pic:nvPicPr>
                         <pic:blipFill>
@@ -4230,12 +4236,12 @@
                 <wp:inline distB="114300" distT="114300" distL="114300" distR="114300">
                   <wp:extent cx="3033713" cy="2033349"/>
                   <wp:effectExtent b="0" l="0" r="0" t="0"/>
-                  <wp:docPr id="1" name="image1.png"/>
+                  <wp:docPr id="1" name="image5.png"/>
                   <a:graphic>
                     <a:graphicData uri="http://schemas.openxmlformats.org/drawingml/2006/picture">
                       <pic:pic>
                         <pic:nvPicPr>
-                          <pic:cNvPr id="0" name="image1.png"/>
+                          <pic:cNvPr id="0" name="image5.png"/>
                           <pic:cNvPicPr preferRelativeResize="0"/>
                         </pic:nvPicPr>
                         <pic:blipFill>
@@ -4353,12 +4359,12 @@
                 <wp:inline distB="114300" distT="114300" distL="114300" distR="114300">
                   <wp:extent cx="3017822" cy="2006656"/>
                   <wp:effectExtent b="0" l="0" r="0" t="0"/>
-                  <wp:docPr id="7" name="image10.png"/>
+                  <wp:docPr id="7" name="image2.png"/>
                   <a:graphic>
                     <a:graphicData uri="http://schemas.openxmlformats.org/drawingml/2006/picture">
                       <pic:pic>
                         <pic:nvPicPr>
-                          <pic:cNvPr id="0" name="image10.png"/>
+                          <pic:cNvPr id="0" name="image2.png"/>
                           <pic:cNvPicPr preferRelativeResize="0"/>
                         </pic:nvPicPr>
                         <pic:blipFill>
@@ -4476,12 +4482,12 @@
                 <wp:inline distB="114300" distT="114300" distL="114300" distR="114300">
                   <wp:extent cx="3407423" cy="2090738"/>
                   <wp:effectExtent b="0" l="0" r="0" t="0"/>
-                  <wp:docPr id="4" name="image11.png"/>
+                  <wp:docPr id="4" name="image7.png"/>
                   <a:graphic>
                     <a:graphicData uri="http://schemas.openxmlformats.org/drawingml/2006/picture">
                       <pic:pic>
                         <pic:nvPicPr>
-                          <pic:cNvPr id="0" name="image11.png"/>
+                          <pic:cNvPr id="0" name="image7.png"/>
                           <pic:cNvPicPr preferRelativeResize="0"/>
                         </pic:nvPicPr>
                         <pic:blipFill>
@@ -4555,6 +4561,1621 @@
         <w:jc w:val="left"/>
         <w:rPr>
           <w:rFonts w:ascii="Times New Roman" w:cs="Times New Roman" w:eastAsia="Times New Roman" w:hAnsi="Times New Roman"/>
+          <w:b w:val="1"/>
+          <w:bCs w:val="1"/>
+        </w:rPr>
+      </w:pPr>
+      <w:r>
+        <w:rPr>
+          <w:rFonts w:ascii="Times New Roman" w:cs="Times New Roman" w:eastAsia="Times New Roman" w:hAnsi="Times New Roman"/>
+          <w:b w:val="1"/>
+          <w:bCs w:val="1"/>
+          <w:rtl w:val="0"/>
+        </w:rPr>
+        <w:t xml:space="preserve">Phase 2</w:t>
+      </w:r>
+    </w:p>
+    <w:p>
+      <w:pPr>
+        <w:spacing w:after="200" w:line="276" w:lineRule="auto"/>
+        <w:jc w:val="left"/>
+        <w:rPr>
+          <w:rFonts w:ascii="Times New Roman" w:cs="Times New Roman" w:eastAsia="Times New Roman" w:hAnsi="Times New Roman"/>
+          <w:b w:val="1"/>
+          <w:bCs w:val="1"/>
+        </w:rPr>
+      </w:pPr>
+      <w:r>
+        <w:rPr>
+          <w:rtl w:val="0"/>
+        </w:rPr>
+      </w:r>
+    </w:p>
+    <w:tbl>
+      <w:tblPr>
+        <w:tblStyle w:val="Table4"/>
+        <w:tblW w:w="9360.0" w:type="dxa"/>
+        <w:jc w:val="left"/>
+        <w:tblBorders>
+          <w:top w:color="000000" w:space="0" w:sz="8" w:val="single"/>
+          <w:left w:color="000000" w:space="0" w:sz="8" w:val="single"/>
+          <w:bottom w:color="000000" w:space="0" w:sz="8" w:val="single"/>
+          <w:right w:color="000000" w:space="0" w:sz="8" w:val="single"/>
+          <w:insideH w:color="000000" w:space="0" w:sz="8" w:val="single"/>
+          <w:insideV w:color="000000" w:space="0" w:sz="8" w:val="single"/>
+        </w:tblBorders>
+        <w:tblLayout w:type="fixed"/>
+        <w:tblLook w:val="0600"/>
+      </w:tblPr>
+      <w:tblGrid>
+        <w:gridCol w:w="2340"/>
+        <w:gridCol w:w="2340"/>
+        <w:gridCol w:w="2340"/>
+        <w:gridCol w:w="2340"/>
+        <w:tblGridChange w:id="0">
+          <w:tblGrid>
+            <w:gridCol w:w="2340"/>
+            <w:gridCol w:w="2340"/>
+            <w:gridCol w:w="2340"/>
+            <w:gridCol w:w="2340"/>
+          </w:tblGrid>
+        </w:tblGridChange>
+      </w:tblGrid>
+      <w:tr>
+        <w:trPr>
+          <w:cantSplit w:val="0"/>
+          <w:tblHeader w:val="0"/>
+        </w:trPr>
+        <w:tc>
+          <w:tcPr>
+            <w:shd w:fill="auto" w:val="clear"/>
+            <w:tcMar>
+              <w:top w:w="100.0" w:type="dxa"/>
+              <w:left w:w="100.0" w:type="dxa"/>
+              <w:bottom w:w="100.0" w:type="dxa"/>
+              <w:right w:w="100.0" w:type="dxa"/>
+            </w:tcMar>
+            <w:vAlign w:val="top"/>
+          </w:tcPr>
+          <w:p>
+            <w:pPr>
+              <w:keepNext w:val="0"/>
+              <w:keepLines w:val="0"/>
+              <w:pageBreakBefore w:val="0"/>
+              <w:widowControl w:val="0"/>
+              <w:pBdr>
+                <w:top w:space="0" w:sz="0" w:val="nil"/>
+                <w:left w:space="0" w:sz="0" w:val="nil"/>
+                <w:bottom w:space="0" w:sz="0" w:val="nil"/>
+                <w:right w:space="0" w:sz="0" w:val="nil"/>
+                <w:between w:space="0" w:sz="0" w:val="nil"/>
+              </w:pBdr>
+              <w:shd w:fill="auto" w:val="clear"/>
+              <w:spacing w:after="0" w:before="0" w:line="240" w:lineRule="auto"/>
+              <w:ind w:left="0" w:right="0" w:firstLine="0"/>
+              <w:jc w:val="left"/>
+              <w:rPr>
+                <w:rFonts w:ascii="Times New Roman" w:cs="Times New Roman" w:eastAsia="Times New Roman" w:hAnsi="Times New Roman"/>
+                <w:b w:val="1"/>
+                <w:bCs w:val="1"/>
+              </w:rPr>
+            </w:pPr>
+            <w:r>
+              <w:rPr>
+                <w:rFonts w:ascii="Times New Roman" w:cs="Times New Roman" w:eastAsia="Times New Roman" w:hAnsi="Times New Roman"/>
+                <w:b w:val="1"/>
+                <w:bCs w:val="1"/>
+                <w:rtl w:val="0"/>
+              </w:rPr>
+              <w:t xml:space="preserve">Weakness Found </w:t>
+            </w:r>
+          </w:p>
+        </w:tc>
+        <w:tc>
+          <w:tcPr>
+            <w:shd w:fill="auto" w:val="clear"/>
+            <w:tcMar>
+              <w:top w:w="100.0" w:type="dxa"/>
+              <w:left w:w="100.0" w:type="dxa"/>
+              <w:bottom w:w="100.0" w:type="dxa"/>
+              <w:right w:w="100.0" w:type="dxa"/>
+            </w:tcMar>
+            <w:vAlign w:val="top"/>
+          </w:tcPr>
+          <w:p>
+            <w:pPr>
+              <w:keepNext w:val="0"/>
+              <w:keepLines w:val="0"/>
+              <w:pageBreakBefore w:val="0"/>
+              <w:widowControl w:val="0"/>
+              <w:pBdr>
+                <w:top w:space="0" w:sz="0" w:val="nil"/>
+                <w:left w:space="0" w:sz="0" w:val="nil"/>
+                <w:bottom w:space="0" w:sz="0" w:val="nil"/>
+                <w:right w:space="0" w:sz="0" w:val="nil"/>
+                <w:between w:space="0" w:sz="0" w:val="nil"/>
+              </w:pBdr>
+              <w:shd w:fill="auto" w:val="clear"/>
+              <w:spacing w:after="0" w:before="0" w:line="240" w:lineRule="auto"/>
+              <w:ind w:left="0" w:right="0" w:firstLine="0"/>
+              <w:jc w:val="left"/>
+              <w:rPr>
+                <w:rFonts w:ascii="Times New Roman" w:cs="Times New Roman" w:eastAsia="Times New Roman" w:hAnsi="Times New Roman"/>
+                <w:b w:val="1"/>
+                <w:bCs w:val="1"/>
+              </w:rPr>
+            </w:pPr>
+            <w:r>
+              <w:rPr>
+                <w:rFonts w:ascii="Times New Roman" w:cs="Times New Roman" w:eastAsia="Times New Roman" w:hAnsi="Times New Roman"/>
+                <w:b w:val="1"/>
+                <w:bCs w:val="1"/>
+                <w:rtl w:val="0"/>
+              </w:rPr>
+              <w:t xml:space="preserve">Frontend / Backend / API / Database </w:t>
+            </w:r>
+          </w:p>
+        </w:tc>
+        <w:tc>
+          <w:tcPr>
+            <w:shd w:fill="auto" w:val="clear"/>
+            <w:tcMar>
+              <w:top w:w="100.0" w:type="dxa"/>
+              <w:left w:w="100.0" w:type="dxa"/>
+              <w:bottom w:w="100.0" w:type="dxa"/>
+              <w:right w:w="100.0" w:type="dxa"/>
+            </w:tcMar>
+            <w:vAlign w:val="top"/>
+          </w:tcPr>
+          <w:p>
+            <w:pPr>
+              <w:keepNext w:val="0"/>
+              <w:keepLines w:val="0"/>
+              <w:pageBreakBefore w:val="0"/>
+              <w:widowControl w:val="0"/>
+              <w:pBdr>
+                <w:top w:space="0" w:sz="0" w:val="nil"/>
+                <w:left w:space="0" w:sz="0" w:val="nil"/>
+                <w:bottom w:space="0" w:sz="0" w:val="nil"/>
+                <w:right w:space="0" w:sz="0" w:val="nil"/>
+                <w:between w:space="0" w:sz="0" w:val="nil"/>
+              </w:pBdr>
+              <w:shd w:fill="auto" w:val="clear"/>
+              <w:spacing w:after="0" w:before="0" w:line="240" w:lineRule="auto"/>
+              <w:ind w:left="0" w:right="0" w:firstLine="0"/>
+              <w:jc w:val="left"/>
+              <w:rPr>
+                <w:rFonts w:ascii="Times New Roman" w:cs="Times New Roman" w:eastAsia="Times New Roman" w:hAnsi="Times New Roman"/>
+                <w:b w:val="1"/>
+                <w:bCs w:val="1"/>
+              </w:rPr>
+            </w:pPr>
+            <w:r>
+              <w:rPr>
+                <w:rFonts w:ascii="Times New Roman" w:cs="Times New Roman" w:eastAsia="Times New Roman" w:hAnsi="Times New Roman"/>
+                <w:b w:val="1"/>
+                <w:bCs w:val="1"/>
+                <w:rtl w:val="0"/>
+              </w:rPr>
+              <w:t xml:space="preserve">Security Category </w:t>
+            </w:r>
+          </w:p>
+        </w:tc>
+        <w:tc>
+          <w:tcPr>
+            <w:shd w:fill="auto" w:val="clear"/>
+            <w:tcMar>
+              <w:top w:w="100.0" w:type="dxa"/>
+              <w:left w:w="100.0" w:type="dxa"/>
+              <w:bottom w:w="100.0" w:type="dxa"/>
+              <w:right w:w="100.0" w:type="dxa"/>
+            </w:tcMar>
+            <w:vAlign w:val="top"/>
+          </w:tcPr>
+          <w:p>
+            <w:pPr>
+              <w:keepNext w:val="0"/>
+              <w:keepLines w:val="0"/>
+              <w:pageBreakBefore w:val="0"/>
+              <w:widowControl w:val="0"/>
+              <w:pBdr>
+                <w:top w:space="0" w:sz="0" w:val="nil"/>
+                <w:left w:space="0" w:sz="0" w:val="nil"/>
+                <w:bottom w:space="0" w:sz="0" w:val="nil"/>
+                <w:right w:space="0" w:sz="0" w:val="nil"/>
+                <w:between w:space="0" w:sz="0" w:val="nil"/>
+              </w:pBdr>
+              <w:shd w:fill="auto" w:val="clear"/>
+              <w:spacing w:after="0" w:before="0" w:line="240" w:lineRule="auto"/>
+              <w:ind w:left="0" w:right="0" w:firstLine="0"/>
+              <w:jc w:val="left"/>
+              <w:rPr>
+                <w:rFonts w:ascii="Times New Roman" w:cs="Times New Roman" w:eastAsia="Times New Roman" w:hAnsi="Times New Roman"/>
+                <w:b w:val="1"/>
+                <w:bCs w:val="1"/>
+              </w:rPr>
+            </w:pPr>
+            <w:r>
+              <w:rPr>
+                <w:rFonts w:ascii="Times New Roman" w:cs="Times New Roman" w:eastAsia="Times New Roman" w:hAnsi="Times New Roman"/>
+                <w:b w:val="1"/>
+                <w:bCs w:val="1"/>
+                <w:rtl w:val="0"/>
+              </w:rPr>
+              <w:t xml:space="preserve">Possible Risk </w:t>
+            </w:r>
+          </w:p>
+        </w:tc>
+      </w:tr>
+      <w:tr>
+        <w:trPr>
+          <w:cantSplit w:val="0"/>
+          <w:tblHeader w:val="0"/>
+        </w:trPr>
+        <w:tc>
+          <w:tcPr>
+            <w:shd w:fill="auto" w:val="clear"/>
+            <w:tcMar>
+              <w:top w:w="100.0" w:type="dxa"/>
+              <w:left w:w="100.0" w:type="dxa"/>
+              <w:bottom w:w="100.0" w:type="dxa"/>
+              <w:right w:w="100.0" w:type="dxa"/>
+            </w:tcMar>
+            <w:vAlign w:val="top"/>
+          </w:tcPr>
+          <w:p>
+            <w:pPr>
+              <w:keepNext w:val="0"/>
+              <w:keepLines w:val="0"/>
+              <w:pageBreakBefore w:val="0"/>
+              <w:widowControl w:val="0"/>
+              <w:pBdr>
+                <w:top w:space="0" w:sz="0" w:val="nil"/>
+                <w:left w:space="0" w:sz="0" w:val="nil"/>
+                <w:bottom w:space="0" w:sz="0" w:val="nil"/>
+                <w:right w:space="0" w:sz="0" w:val="nil"/>
+                <w:between w:space="0" w:sz="0" w:val="nil"/>
+              </w:pBdr>
+              <w:shd w:fill="auto" w:val="clear"/>
+              <w:spacing w:after="0" w:before="0" w:line="240" w:lineRule="auto"/>
+              <w:ind w:left="0" w:right="0" w:firstLine="0"/>
+              <w:jc w:val="left"/>
+              <w:rPr>
+                <w:rFonts w:ascii="Times New Roman" w:cs="Times New Roman" w:eastAsia="Times New Roman" w:hAnsi="Times New Roman"/>
+              </w:rPr>
+            </w:pPr>
+            <w:r>
+              <w:rPr>
+                <w:rFonts w:ascii="Times New Roman" w:cs="Times New Roman" w:eastAsia="Times New Roman" w:hAnsi="Times New Roman"/>
+                <w:rtl w:val="0"/>
+              </w:rPr>
+              <w:t xml:space="preserve">Invalid BMI data accepted </w:t>
+            </w:r>
+          </w:p>
+        </w:tc>
+        <w:tc>
+          <w:tcPr>
+            <w:shd w:fill="auto" w:val="clear"/>
+            <w:tcMar>
+              <w:top w:w="100.0" w:type="dxa"/>
+              <w:left w:w="100.0" w:type="dxa"/>
+              <w:bottom w:w="100.0" w:type="dxa"/>
+              <w:right w:w="100.0" w:type="dxa"/>
+            </w:tcMar>
+            <w:vAlign w:val="top"/>
+          </w:tcPr>
+          <w:p>
+            <w:pPr>
+              <w:keepNext w:val="0"/>
+              <w:keepLines w:val="0"/>
+              <w:pageBreakBefore w:val="0"/>
+              <w:widowControl w:val="0"/>
+              <w:pBdr>
+                <w:top w:space="0" w:sz="0" w:val="nil"/>
+                <w:left w:space="0" w:sz="0" w:val="nil"/>
+                <w:bottom w:space="0" w:sz="0" w:val="nil"/>
+                <w:right w:space="0" w:sz="0" w:val="nil"/>
+                <w:between w:space="0" w:sz="0" w:val="nil"/>
+              </w:pBdr>
+              <w:shd w:fill="auto" w:val="clear"/>
+              <w:spacing w:after="0" w:before="0" w:line="240" w:lineRule="auto"/>
+              <w:ind w:left="0" w:right="0" w:firstLine="0"/>
+              <w:jc w:val="left"/>
+              <w:rPr>
+                <w:rFonts w:ascii="Times New Roman" w:cs="Times New Roman" w:eastAsia="Times New Roman" w:hAnsi="Times New Roman"/>
+              </w:rPr>
+            </w:pPr>
+            <w:r>
+              <w:rPr>
+                <w:rFonts w:ascii="Times New Roman" w:cs="Times New Roman" w:eastAsia="Times New Roman" w:hAnsi="Times New Roman"/>
+                <w:rtl w:val="0"/>
+              </w:rPr>
+              <w:t xml:space="preserve">Backend </w:t>
+            </w:r>
+          </w:p>
+        </w:tc>
+        <w:tc>
+          <w:tcPr>
+            <w:shd w:fill="auto" w:val="clear"/>
+            <w:tcMar>
+              <w:top w:w="100.0" w:type="dxa"/>
+              <w:left w:w="100.0" w:type="dxa"/>
+              <w:bottom w:w="100.0" w:type="dxa"/>
+              <w:right w:w="100.0" w:type="dxa"/>
+            </w:tcMar>
+            <w:vAlign w:val="top"/>
+          </w:tcPr>
+          <w:p>
+            <w:pPr>
+              <w:keepNext w:val="0"/>
+              <w:keepLines w:val="0"/>
+              <w:pageBreakBefore w:val="0"/>
+              <w:widowControl w:val="0"/>
+              <w:pBdr>
+                <w:top w:space="0" w:sz="0" w:val="nil"/>
+                <w:left w:space="0" w:sz="0" w:val="nil"/>
+                <w:bottom w:space="0" w:sz="0" w:val="nil"/>
+                <w:right w:space="0" w:sz="0" w:val="nil"/>
+                <w:between w:space="0" w:sz="0" w:val="nil"/>
+              </w:pBdr>
+              <w:shd w:fill="auto" w:val="clear"/>
+              <w:spacing w:after="0" w:before="0" w:line="240" w:lineRule="auto"/>
+              <w:ind w:left="0" w:right="0" w:firstLine="0"/>
+              <w:jc w:val="left"/>
+              <w:rPr>
+                <w:rFonts w:ascii="Times New Roman" w:cs="Times New Roman" w:eastAsia="Times New Roman" w:hAnsi="Times New Roman"/>
+              </w:rPr>
+            </w:pPr>
+            <w:r>
+              <w:rPr>
+                <w:rFonts w:ascii="Times New Roman" w:cs="Times New Roman" w:eastAsia="Times New Roman" w:hAnsi="Times New Roman"/>
+                <w:rtl w:val="0"/>
+              </w:rPr>
+              <w:t xml:space="preserve">Missing backend validation </w:t>
+            </w:r>
+          </w:p>
+        </w:tc>
+        <w:tc>
+          <w:tcPr>
+            <w:shd w:fill="auto" w:val="clear"/>
+            <w:tcMar>
+              <w:top w:w="100.0" w:type="dxa"/>
+              <w:left w:w="100.0" w:type="dxa"/>
+              <w:bottom w:w="100.0" w:type="dxa"/>
+              <w:right w:w="100.0" w:type="dxa"/>
+            </w:tcMar>
+            <w:vAlign w:val="top"/>
+          </w:tcPr>
+          <w:p>
+            <w:pPr>
+              <w:keepNext w:val="0"/>
+              <w:keepLines w:val="0"/>
+              <w:pageBreakBefore w:val="0"/>
+              <w:widowControl w:val="0"/>
+              <w:pBdr>
+                <w:top w:space="0" w:sz="0" w:val="nil"/>
+                <w:left w:space="0" w:sz="0" w:val="nil"/>
+                <w:bottom w:space="0" w:sz="0" w:val="nil"/>
+                <w:right w:space="0" w:sz="0" w:val="nil"/>
+                <w:between w:space="0" w:sz="0" w:val="nil"/>
+              </w:pBdr>
+              <w:shd w:fill="auto" w:val="clear"/>
+              <w:spacing w:after="0" w:before="0" w:line="240" w:lineRule="auto"/>
+              <w:ind w:left="0" w:right="0" w:firstLine="0"/>
+              <w:jc w:val="left"/>
+              <w:rPr>
+                <w:rFonts w:ascii="Times New Roman" w:cs="Times New Roman" w:eastAsia="Times New Roman" w:hAnsi="Times New Roman"/>
+              </w:rPr>
+            </w:pPr>
+            <w:r>
+              <w:rPr>
+                <w:rFonts w:ascii="Times New Roman" w:cs="Times New Roman" w:eastAsia="Times New Roman" w:hAnsi="Times New Roman"/>
+                <w:rtl w:val="0"/>
+              </w:rPr>
+              <w:t xml:space="preserve">Invalid BMI data can be stored in the database </w:t>
+            </w:r>
+          </w:p>
+        </w:tc>
+      </w:tr>
+      <w:tr>
+        <w:trPr>
+          <w:cantSplit w:val="0"/>
+          <w:tblHeader w:val="0"/>
+        </w:trPr>
+        <w:tc>
+          <w:tcPr>
+            <w:shd w:fill="auto" w:val="clear"/>
+            <w:tcMar>
+              <w:top w:w="100.0" w:type="dxa"/>
+              <w:left w:w="100.0" w:type="dxa"/>
+              <w:bottom w:w="100.0" w:type="dxa"/>
+              <w:right w:w="100.0" w:type="dxa"/>
+            </w:tcMar>
+            <w:vAlign w:val="top"/>
+          </w:tcPr>
+          <w:p>
+            <w:pPr>
+              <w:keepNext w:val="0"/>
+              <w:keepLines w:val="0"/>
+              <w:pageBreakBefore w:val="0"/>
+              <w:widowControl w:val="0"/>
+              <w:pBdr>
+                <w:top w:space="0" w:sz="0" w:val="nil"/>
+                <w:left w:space="0" w:sz="0" w:val="nil"/>
+                <w:bottom w:space="0" w:sz="0" w:val="nil"/>
+                <w:right w:space="0" w:sz="0" w:val="nil"/>
+                <w:between w:space="0" w:sz="0" w:val="nil"/>
+              </w:pBdr>
+              <w:shd w:fill="auto" w:val="clear"/>
+              <w:spacing w:after="0" w:before="0" w:line="240" w:lineRule="auto"/>
+              <w:ind w:left="0" w:right="0" w:firstLine="0"/>
+              <w:jc w:val="left"/>
+              <w:rPr>
+                <w:rFonts w:ascii="Times New Roman" w:cs="Times New Roman" w:eastAsia="Times New Roman" w:hAnsi="Times New Roman"/>
+              </w:rPr>
+            </w:pPr>
+            <w:r>
+              <w:rPr>
+                <w:rFonts w:ascii="Times New Roman" w:cs="Times New Roman" w:eastAsia="Times New Roman" w:hAnsi="Times New Roman"/>
+                <w:rtl w:val="0"/>
+              </w:rPr>
+              <w:t xml:space="preserve">User can access another user’s BMI record </w:t>
+            </w:r>
+          </w:p>
+        </w:tc>
+        <w:tc>
+          <w:tcPr>
+            <w:shd w:fill="auto" w:val="clear"/>
+            <w:tcMar>
+              <w:top w:w="100.0" w:type="dxa"/>
+              <w:left w:w="100.0" w:type="dxa"/>
+              <w:bottom w:w="100.0" w:type="dxa"/>
+              <w:right w:w="100.0" w:type="dxa"/>
+            </w:tcMar>
+            <w:vAlign w:val="top"/>
+          </w:tcPr>
+          <w:p>
+            <w:pPr>
+              <w:keepNext w:val="0"/>
+              <w:keepLines w:val="0"/>
+              <w:pageBreakBefore w:val="0"/>
+              <w:widowControl w:val="0"/>
+              <w:pBdr>
+                <w:top w:space="0" w:sz="0" w:val="nil"/>
+                <w:left w:space="0" w:sz="0" w:val="nil"/>
+                <w:bottom w:space="0" w:sz="0" w:val="nil"/>
+                <w:right w:space="0" w:sz="0" w:val="nil"/>
+                <w:between w:space="0" w:sz="0" w:val="nil"/>
+              </w:pBdr>
+              <w:shd w:fill="auto" w:val="clear"/>
+              <w:spacing w:after="0" w:before="0" w:line="240" w:lineRule="auto"/>
+              <w:ind w:left="0" w:right="0" w:firstLine="0"/>
+              <w:jc w:val="left"/>
+              <w:rPr>
+                <w:rFonts w:ascii="Times New Roman" w:cs="Times New Roman" w:eastAsia="Times New Roman" w:hAnsi="Times New Roman"/>
+              </w:rPr>
+            </w:pPr>
+            <w:r>
+              <w:rPr>
+                <w:rFonts w:ascii="Times New Roman" w:cs="Times New Roman" w:eastAsia="Times New Roman" w:hAnsi="Times New Roman"/>
+                <w:rtl w:val="0"/>
+              </w:rPr>
+              <w:t xml:space="preserve">API / Backend </w:t>
+            </w:r>
+          </w:p>
+        </w:tc>
+        <w:tc>
+          <w:tcPr>
+            <w:shd w:fill="auto" w:val="clear"/>
+            <w:tcMar>
+              <w:top w:w="100.0" w:type="dxa"/>
+              <w:left w:w="100.0" w:type="dxa"/>
+              <w:bottom w:w="100.0" w:type="dxa"/>
+              <w:right w:w="100.0" w:type="dxa"/>
+            </w:tcMar>
+            <w:vAlign w:val="top"/>
+          </w:tcPr>
+          <w:p>
+            <w:pPr>
+              <w:keepNext w:val="0"/>
+              <w:keepLines w:val="0"/>
+              <w:pageBreakBefore w:val="0"/>
+              <w:widowControl w:val="0"/>
+              <w:pBdr>
+                <w:top w:space="0" w:sz="0" w:val="nil"/>
+                <w:left w:space="0" w:sz="0" w:val="nil"/>
+                <w:bottom w:space="0" w:sz="0" w:val="nil"/>
+                <w:right w:space="0" w:sz="0" w:val="nil"/>
+                <w:between w:space="0" w:sz="0" w:val="nil"/>
+              </w:pBdr>
+              <w:shd w:fill="auto" w:val="clear"/>
+              <w:spacing w:after="0" w:before="0" w:line="240" w:lineRule="auto"/>
+              <w:ind w:left="0" w:right="0" w:firstLine="0"/>
+              <w:jc w:val="left"/>
+              <w:rPr>
+                <w:rFonts w:ascii="Times New Roman" w:cs="Times New Roman" w:eastAsia="Times New Roman" w:hAnsi="Times New Roman"/>
+              </w:rPr>
+            </w:pPr>
+            <w:r>
+              <w:rPr>
+                <w:rFonts w:ascii="Times New Roman" w:cs="Times New Roman" w:eastAsia="Times New Roman" w:hAnsi="Times New Roman"/>
+                <w:rtl w:val="0"/>
+              </w:rPr>
+              <w:t xml:space="preserve">Broken Object Level Authorization </w:t>
+            </w:r>
+          </w:p>
+        </w:tc>
+        <w:tc>
+          <w:tcPr>
+            <w:shd w:fill="auto" w:val="clear"/>
+            <w:tcMar>
+              <w:top w:w="100.0" w:type="dxa"/>
+              <w:left w:w="100.0" w:type="dxa"/>
+              <w:bottom w:w="100.0" w:type="dxa"/>
+              <w:right w:w="100.0" w:type="dxa"/>
+            </w:tcMar>
+            <w:vAlign w:val="top"/>
+          </w:tcPr>
+          <w:p>
+            <w:pPr>
+              <w:keepNext w:val="0"/>
+              <w:keepLines w:val="0"/>
+              <w:pageBreakBefore w:val="0"/>
+              <w:widowControl w:val="0"/>
+              <w:pBdr>
+                <w:top w:space="0" w:sz="0" w:val="nil"/>
+                <w:left w:space="0" w:sz="0" w:val="nil"/>
+                <w:bottom w:space="0" w:sz="0" w:val="nil"/>
+                <w:right w:space="0" w:sz="0" w:val="nil"/>
+                <w:between w:space="0" w:sz="0" w:val="nil"/>
+              </w:pBdr>
+              <w:shd w:fill="auto" w:val="clear"/>
+              <w:spacing w:after="0" w:before="0" w:line="240" w:lineRule="auto"/>
+              <w:ind w:left="0" w:right="0" w:firstLine="0"/>
+              <w:jc w:val="left"/>
+              <w:rPr>
+                <w:rFonts w:ascii="Times New Roman" w:cs="Times New Roman" w:eastAsia="Times New Roman" w:hAnsi="Times New Roman"/>
+              </w:rPr>
+            </w:pPr>
+            <w:r>
+              <w:rPr>
+                <w:rFonts w:ascii="Times New Roman" w:cs="Times New Roman" w:eastAsia="Times New Roman" w:hAnsi="Times New Roman"/>
+                <w:rtl w:val="0"/>
+              </w:rPr>
+              <w:t xml:space="preserve">Privacy violation because users can view records that do not belong to them </w:t>
+            </w:r>
+          </w:p>
+        </w:tc>
+      </w:tr>
+      <w:tr>
+        <w:trPr>
+          <w:cantSplit w:val="0"/>
+          <w:tblHeader w:val="0"/>
+        </w:trPr>
+        <w:tc>
+          <w:tcPr>
+            <w:shd w:fill="auto" w:val="clear"/>
+            <w:tcMar>
+              <w:top w:w="100.0" w:type="dxa"/>
+              <w:left w:w="100.0" w:type="dxa"/>
+              <w:bottom w:w="100.0" w:type="dxa"/>
+              <w:right w:w="100.0" w:type="dxa"/>
+            </w:tcMar>
+            <w:vAlign w:val="top"/>
+          </w:tcPr>
+          <w:p>
+            <w:pPr>
+              <w:keepNext w:val="0"/>
+              <w:keepLines w:val="0"/>
+              <w:pageBreakBefore w:val="0"/>
+              <w:widowControl w:val="0"/>
+              <w:pBdr>
+                <w:top w:space="0" w:sz="0" w:val="nil"/>
+                <w:left w:space="0" w:sz="0" w:val="nil"/>
+                <w:bottom w:space="0" w:sz="0" w:val="nil"/>
+                <w:right w:space="0" w:sz="0" w:val="nil"/>
+                <w:between w:space="0" w:sz="0" w:val="nil"/>
+              </w:pBdr>
+              <w:shd w:fill="auto" w:val="clear"/>
+              <w:spacing w:after="0" w:before="0" w:line="240" w:lineRule="auto"/>
+              <w:ind w:left="0" w:right="0" w:firstLine="0"/>
+              <w:jc w:val="left"/>
+              <w:rPr>
+                <w:rFonts w:ascii="Times New Roman" w:cs="Times New Roman" w:eastAsia="Times New Roman" w:hAnsi="Times New Roman"/>
+              </w:rPr>
+            </w:pPr>
+            <w:r>
+              <w:rPr>
+                <w:rFonts w:ascii="Times New Roman" w:cs="Times New Roman" w:eastAsia="Times New Roman" w:hAnsi="Times New Roman"/>
+                <w:rtl w:val="0"/>
+              </w:rPr>
+              <w:t xml:space="preserve">Normal user can access staff route </w:t>
+            </w:r>
+          </w:p>
+        </w:tc>
+        <w:tc>
+          <w:tcPr>
+            <w:shd w:fill="auto" w:val="clear"/>
+            <w:tcMar>
+              <w:top w:w="100.0" w:type="dxa"/>
+              <w:left w:w="100.0" w:type="dxa"/>
+              <w:bottom w:w="100.0" w:type="dxa"/>
+              <w:right w:w="100.0" w:type="dxa"/>
+            </w:tcMar>
+            <w:vAlign w:val="top"/>
+          </w:tcPr>
+          <w:p>
+            <w:pPr>
+              <w:keepNext w:val="0"/>
+              <w:keepLines w:val="0"/>
+              <w:pageBreakBefore w:val="0"/>
+              <w:widowControl w:val="0"/>
+              <w:pBdr>
+                <w:top w:space="0" w:sz="0" w:val="nil"/>
+                <w:left w:space="0" w:sz="0" w:val="nil"/>
+                <w:bottom w:space="0" w:sz="0" w:val="nil"/>
+                <w:right w:space="0" w:sz="0" w:val="nil"/>
+                <w:between w:space="0" w:sz="0" w:val="nil"/>
+              </w:pBdr>
+              <w:shd w:fill="auto" w:val="clear"/>
+              <w:spacing w:after="0" w:before="0" w:line="240" w:lineRule="auto"/>
+              <w:ind w:left="0" w:right="0" w:firstLine="0"/>
+              <w:jc w:val="left"/>
+              <w:rPr>
+                <w:rFonts w:ascii="Times New Roman" w:cs="Times New Roman" w:eastAsia="Times New Roman" w:hAnsi="Times New Roman"/>
+              </w:rPr>
+            </w:pPr>
+            <w:r>
+              <w:rPr>
+                <w:rFonts w:ascii="Times New Roman" w:cs="Times New Roman" w:eastAsia="Times New Roman" w:hAnsi="Times New Roman"/>
+                <w:rtl w:val="0"/>
+              </w:rPr>
+              <w:t xml:space="preserve">API / Backend </w:t>
+            </w:r>
+          </w:p>
+        </w:tc>
+        <w:tc>
+          <w:tcPr>
+            <w:shd w:fill="auto" w:val="clear"/>
+            <w:tcMar>
+              <w:top w:w="100.0" w:type="dxa"/>
+              <w:left w:w="100.0" w:type="dxa"/>
+              <w:bottom w:w="100.0" w:type="dxa"/>
+              <w:right w:w="100.0" w:type="dxa"/>
+            </w:tcMar>
+            <w:vAlign w:val="top"/>
+          </w:tcPr>
+          <w:p>
+            <w:pPr>
+              <w:keepNext w:val="0"/>
+              <w:keepLines w:val="0"/>
+              <w:pageBreakBefore w:val="0"/>
+              <w:widowControl w:val="0"/>
+              <w:pBdr>
+                <w:top w:space="0" w:sz="0" w:val="nil"/>
+                <w:left w:space="0" w:sz="0" w:val="nil"/>
+                <w:bottom w:space="0" w:sz="0" w:val="nil"/>
+                <w:right w:space="0" w:sz="0" w:val="nil"/>
+                <w:between w:space="0" w:sz="0" w:val="nil"/>
+              </w:pBdr>
+              <w:shd w:fill="auto" w:val="clear"/>
+              <w:spacing w:after="0" w:before="0" w:line="240" w:lineRule="auto"/>
+              <w:ind w:left="0" w:right="0" w:firstLine="0"/>
+              <w:jc w:val="left"/>
+              <w:rPr>
+                <w:rFonts w:ascii="Times New Roman" w:cs="Times New Roman" w:eastAsia="Times New Roman" w:hAnsi="Times New Roman"/>
+              </w:rPr>
+            </w:pPr>
+            <w:r>
+              <w:rPr>
+                <w:rFonts w:ascii="Times New Roman" w:cs="Times New Roman" w:eastAsia="Times New Roman" w:hAnsi="Times New Roman"/>
+                <w:rtl w:val="0"/>
+              </w:rPr>
+              <w:t xml:space="preserve">Broken Function Level Authorization </w:t>
+            </w:r>
+          </w:p>
+        </w:tc>
+        <w:tc>
+          <w:tcPr>
+            <w:shd w:fill="auto" w:val="clear"/>
+            <w:tcMar>
+              <w:top w:w="100.0" w:type="dxa"/>
+              <w:left w:w="100.0" w:type="dxa"/>
+              <w:bottom w:w="100.0" w:type="dxa"/>
+              <w:right w:w="100.0" w:type="dxa"/>
+            </w:tcMar>
+            <w:vAlign w:val="top"/>
+          </w:tcPr>
+          <w:p>
+            <w:pPr>
+              <w:keepNext w:val="0"/>
+              <w:keepLines w:val="0"/>
+              <w:pageBreakBefore w:val="0"/>
+              <w:widowControl w:val="0"/>
+              <w:pBdr>
+                <w:top w:space="0" w:sz="0" w:val="nil"/>
+                <w:left w:space="0" w:sz="0" w:val="nil"/>
+                <w:bottom w:space="0" w:sz="0" w:val="nil"/>
+                <w:right w:space="0" w:sz="0" w:val="nil"/>
+                <w:between w:space="0" w:sz="0" w:val="nil"/>
+              </w:pBdr>
+              <w:shd w:fill="auto" w:val="clear"/>
+              <w:spacing w:after="0" w:before="0" w:line="240" w:lineRule="auto"/>
+              <w:ind w:left="0" w:right="0" w:firstLine="0"/>
+              <w:jc w:val="left"/>
+              <w:rPr>
+                <w:rFonts w:ascii="Times New Roman" w:cs="Times New Roman" w:eastAsia="Times New Roman" w:hAnsi="Times New Roman"/>
+              </w:rPr>
+            </w:pPr>
+            <w:r>
+              <w:rPr>
+                <w:rFonts w:ascii="Times New Roman" w:cs="Times New Roman" w:eastAsia="Times New Roman" w:hAnsi="Times New Roman"/>
+                <w:rtl w:val="0"/>
+              </w:rPr>
+              <w:t xml:space="preserve">Normal user can view staff-level BMI records </w:t>
+            </w:r>
+          </w:p>
+        </w:tc>
+      </w:tr>
+      <w:tr>
+        <w:trPr>
+          <w:cantSplit w:val="0"/>
+          <w:tblHeader w:val="0"/>
+        </w:trPr>
+        <w:tc>
+          <w:tcPr>
+            <w:shd w:fill="auto" w:val="clear"/>
+            <w:tcMar>
+              <w:top w:w="100.0" w:type="dxa"/>
+              <w:left w:w="100.0" w:type="dxa"/>
+              <w:bottom w:w="100.0" w:type="dxa"/>
+              <w:right w:w="100.0" w:type="dxa"/>
+            </w:tcMar>
+            <w:vAlign w:val="top"/>
+          </w:tcPr>
+          <w:p>
+            <w:pPr>
+              <w:keepNext w:val="0"/>
+              <w:keepLines w:val="0"/>
+              <w:pageBreakBefore w:val="0"/>
+              <w:widowControl w:val="0"/>
+              <w:pBdr>
+                <w:top w:space="0" w:sz="0" w:val="nil"/>
+                <w:left w:space="0" w:sz="0" w:val="nil"/>
+                <w:bottom w:space="0" w:sz="0" w:val="nil"/>
+                <w:right w:space="0" w:sz="0" w:val="nil"/>
+                <w:between w:space="0" w:sz="0" w:val="nil"/>
+              </w:pBdr>
+              <w:shd w:fill="auto" w:val="clear"/>
+              <w:spacing w:after="0" w:before="0" w:line="240" w:lineRule="auto"/>
+              <w:ind w:left="0" w:right="0" w:firstLine="0"/>
+              <w:jc w:val="left"/>
+              <w:rPr>
+                <w:rFonts w:ascii="Times New Roman" w:cs="Times New Roman" w:eastAsia="Times New Roman" w:hAnsi="Times New Roman"/>
+              </w:rPr>
+            </w:pPr>
+            <w:r>
+              <w:rPr>
+                <w:rFonts w:ascii="Times New Roman" w:cs="Times New Roman" w:eastAsia="Times New Roman" w:hAnsi="Times New Roman"/>
+                <w:rtl w:val="0"/>
+              </w:rPr>
+              <w:t xml:space="preserve">Normal user can access admin route </w:t>
+            </w:r>
+          </w:p>
+        </w:tc>
+        <w:tc>
+          <w:tcPr>
+            <w:shd w:fill="auto" w:val="clear"/>
+            <w:tcMar>
+              <w:top w:w="100.0" w:type="dxa"/>
+              <w:left w:w="100.0" w:type="dxa"/>
+              <w:bottom w:w="100.0" w:type="dxa"/>
+              <w:right w:w="100.0" w:type="dxa"/>
+            </w:tcMar>
+            <w:vAlign w:val="top"/>
+          </w:tcPr>
+          <w:p>
+            <w:pPr>
+              <w:keepNext w:val="0"/>
+              <w:keepLines w:val="0"/>
+              <w:pageBreakBefore w:val="0"/>
+              <w:widowControl w:val="0"/>
+              <w:pBdr>
+                <w:top w:space="0" w:sz="0" w:val="nil"/>
+                <w:left w:space="0" w:sz="0" w:val="nil"/>
+                <w:bottom w:space="0" w:sz="0" w:val="nil"/>
+                <w:right w:space="0" w:sz="0" w:val="nil"/>
+                <w:between w:space="0" w:sz="0" w:val="nil"/>
+              </w:pBdr>
+              <w:shd w:fill="auto" w:val="clear"/>
+              <w:spacing w:after="0" w:before="0" w:line="240" w:lineRule="auto"/>
+              <w:ind w:left="0" w:right="0" w:firstLine="0"/>
+              <w:jc w:val="left"/>
+              <w:rPr>
+                <w:rFonts w:ascii="Times New Roman" w:cs="Times New Roman" w:eastAsia="Times New Roman" w:hAnsi="Times New Roman"/>
+              </w:rPr>
+            </w:pPr>
+            <w:r>
+              <w:rPr>
+                <w:rFonts w:ascii="Times New Roman" w:cs="Times New Roman" w:eastAsia="Times New Roman" w:hAnsi="Times New Roman"/>
+                <w:rtl w:val="0"/>
+              </w:rPr>
+              <w:t xml:space="preserve">API / Backend </w:t>
+            </w:r>
+          </w:p>
+        </w:tc>
+        <w:tc>
+          <w:tcPr>
+            <w:shd w:fill="auto" w:val="clear"/>
+            <w:tcMar>
+              <w:top w:w="100.0" w:type="dxa"/>
+              <w:left w:w="100.0" w:type="dxa"/>
+              <w:bottom w:w="100.0" w:type="dxa"/>
+              <w:right w:w="100.0" w:type="dxa"/>
+            </w:tcMar>
+            <w:vAlign w:val="top"/>
+          </w:tcPr>
+          <w:p>
+            <w:pPr>
+              <w:keepNext w:val="0"/>
+              <w:keepLines w:val="0"/>
+              <w:pageBreakBefore w:val="0"/>
+              <w:widowControl w:val="0"/>
+              <w:pBdr>
+                <w:top w:space="0" w:sz="0" w:val="nil"/>
+                <w:left w:space="0" w:sz="0" w:val="nil"/>
+                <w:bottom w:space="0" w:sz="0" w:val="nil"/>
+                <w:right w:space="0" w:sz="0" w:val="nil"/>
+                <w:between w:space="0" w:sz="0" w:val="nil"/>
+              </w:pBdr>
+              <w:shd w:fill="auto" w:val="clear"/>
+              <w:spacing w:after="0" w:before="0" w:line="240" w:lineRule="auto"/>
+              <w:ind w:left="0" w:right="0" w:firstLine="0"/>
+              <w:jc w:val="left"/>
+              <w:rPr>
+                <w:rFonts w:ascii="Times New Roman" w:cs="Times New Roman" w:eastAsia="Times New Roman" w:hAnsi="Times New Roman"/>
+              </w:rPr>
+            </w:pPr>
+            <w:r>
+              <w:rPr>
+                <w:rFonts w:ascii="Times New Roman" w:cs="Times New Roman" w:eastAsia="Times New Roman" w:hAnsi="Times New Roman"/>
+                <w:rtl w:val="0"/>
+              </w:rPr>
+              <w:t xml:space="preserve">Broken Function Level Authorization </w:t>
+            </w:r>
+          </w:p>
+        </w:tc>
+        <w:tc>
+          <w:tcPr>
+            <w:shd w:fill="auto" w:val="clear"/>
+            <w:tcMar>
+              <w:top w:w="100.0" w:type="dxa"/>
+              <w:left w:w="100.0" w:type="dxa"/>
+              <w:bottom w:w="100.0" w:type="dxa"/>
+              <w:right w:w="100.0" w:type="dxa"/>
+            </w:tcMar>
+            <w:vAlign w:val="top"/>
+          </w:tcPr>
+          <w:p>
+            <w:pPr>
+              <w:keepNext w:val="0"/>
+              <w:keepLines w:val="0"/>
+              <w:pageBreakBefore w:val="0"/>
+              <w:widowControl w:val="0"/>
+              <w:pBdr>
+                <w:top w:space="0" w:sz="0" w:val="nil"/>
+                <w:left w:space="0" w:sz="0" w:val="nil"/>
+                <w:bottom w:space="0" w:sz="0" w:val="nil"/>
+                <w:right w:space="0" w:sz="0" w:val="nil"/>
+                <w:between w:space="0" w:sz="0" w:val="nil"/>
+              </w:pBdr>
+              <w:shd w:fill="auto" w:val="clear"/>
+              <w:spacing w:after="0" w:before="0" w:line="240" w:lineRule="auto"/>
+              <w:ind w:left="0" w:right="0" w:firstLine="0"/>
+              <w:jc w:val="left"/>
+              <w:rPr>
+                <w:rFonts w:ascii="Times New Roman" w:cs="Times New Roman" w:eastAsia="Times New Roman" w:hAnsi="Times New Roman"/>
+              </w:rPr>
+            </w:pPr>
+            <w:r>
+              <w:rPr>
+                <w:rFonts w:ascii="Times New Roman" w:cs="Times New Roman" w:eastAsia="Times New Roman" w:hAnsi="Times New Roman"/>
+                <w:rtl w:val="0"/>
+              </w:rPr>
+              <w:t xml:space="preserve">Unauthorized user may access admin functions </w:t>
+            </w:r>
+          </w:p>
+        </w:tc>
+      </w:tr>
+      <w:tr>
+        <w:trPr>
+          <w:cantSplit w:val="0"/>
+          <w:tblHeader w:val="0"/>
+        </w:trPr>
+        <w:tc>
+          <w:tcPr>
+            <w:shd w:fill="auto" w:val="clear"/>
+            <w:tcMar>
+              <w:top w:w="100.0" w:type="dxa"/>
+              <w:left w:w="100.0" w:type="dxa"/>
+              <w:bottom w:w="100.0" w:type="dxa"/>
+              <w:right w:w="100.0" w:type="dxa"/>
+            </w:tcMar>
+            <w:vAlign w:val="top"/>
+          </w:tcPr>
+          <w:p>
+            <w:pPr>
+              <w:keepNext w:val="0"/>
+              <w:keepLines w:val="0"/>
+              <w:pageBreakBefore w:val="0"/>
+              <w:widowControl w:val="0"/>
+              <w:pBdr>
+                <w:top w:space="0" w:sz="0" w:val="nil"/>
+                <w:left w:space="0" w:sz="0" w:val="nil"/>
+                <w:bottom w:space="0" w:sz="0" w:val="nil"/>
+                <w:right w:space="0" w:sz="0" w:val="nil"/>
+                <w:between w:space="0" w:sz="0" w:val="nil"/>
+              </w:pBdr>
+              <w:shd w:fill="auto" w:val="clear"/>
+              <w:spacing w:after="0" w:before="0" w:line="240" w:lineRule="auto"/>
+              <w:ind w:left="0" w:right="0" w:firstLine="0"/>
+              <w:jc w:val="left"/>
+              <w:rPr>
+                <w:rFonts w:ascii="Times New Roman" w:cs="Times New Roman" w:eastAsia="Times New Roman" w:hAnsi="Times New Roman"/>
+              </w:rPr>
+            </w:pPr>
+            <w:r>
+              <w:rPr>
+                <w:rFonts w:ascii="Times New Roman" w:cs="Times New Roman" w:eastAsia="Times New Roman" w:hAnsi="Times New Roman"/>
+                <w:rtl w:val="0"/>
+              </w:rPr>
+              <w:t xml:space="preserve">XSS payload executes in notes </w:t>
+            </w:r>
+          </w:p>
+        </w:tc>
+        <w:tc>
+          <w:tcPr>
+            <w:shd w:fill="auto" w:val="clear"/>
+            <w:tcMar>
+              <w:top w:w="100.0" w:type="dxa"/>
+              <w:left w:w="100.0" w:type="dxa"/>
+              <w:bottom w:w="100.0" w:type="dxa"/>
+              <w:right w:w="100.0" w:type="dxa"/>
+            </w:tcMar>
+            <w:vAlign w:val="top"/>
+          </w:tcPr>
+          <w:p>
+            <w:pPr>
+              <w:keepNext w:val="0"/>
+              <w:keepLines w:val="0"/>
+              <w:pageBreakBefore w:val="0"/>
+              <w:widowControl w:val="0"/>
+              <w:pBdr>
+                <w:top w:space="0" w:sz="0" w:val="nil"/>
+                <w:left w:space="0" w:sz="0" w:val="nil"/>
+                <w:bottom w:space="0" w:sz="0" w:val="nil"/>
+                <w:right w:space="0" w:sz="0" w:val="nil"/>
+                <w:between w:space="0" w:sz="0" w:val="nil"/>
+              </w:pBdr>
+              <w:shd w:fill="auto" w:val="clear"/>
+              <w:spacing w:after="0" w:before="0" w:line="240" w:lineRule="auto"/>
+              <w:ind w:left="0" w:right="0" w:firstLine="0"/>
+              <w:jc w:val="left"/>
+              <w:rPr>
+                <w:rFonts w:ascii="Times New Roman" w:cs="Times New Roman" w:eastAsia="Times New Roman" w:hAnsi="Times New Roman"/>
+              </w:rPr>
+            </w:pPr>
+            <w:r>
+              <w:rPr>
+                <w:rFonts w:ascii="Times New Roman" w:cs="Times New Roman" w:eastAsia="Times New Roman" w:hAnsi="Times New Roman"/>
+                <w:rtl w:val="0"/>
+              </w:rPr>
+              <w:t xml:space="preserve">Frontend </w:t>
+            </w:r>
+          </w:p>
+        </w:tc>
+        <w:tc>
+          <w:tcPr>
+            <w:shd w:fill="auto" w:val="clear"/>
+            <w:tcMar>
+              <w:top w:w="100.0" w:type="dxa"/>
+              <w:left w:w="100.0" w:type="dxa"/>
+              <w:bottom w:w="100.0" w:type="dxa"/>
+              <w:right w:w="100.0" w:type="dxa"/>
+            </w:tcMar>
+            <w:vAlign w:val="top"/>
+          </w:tcPr>
+          <w:p>
+            <w:pPr>
+              <w:keepNext w:val="0"/>
+              <w:keepLines w:val="0"/>
+              <w:pageBreakBefore w:val="0"/>
+              <w:widowControl w:val="0"/>
+              <w:pBdr>
+                <w:top w:space="0" w:sz="0" w:val="nil"/>
+                <w:left w:space="0" w:sz="0" w:val="nil"/>
+                <w:bottom w:space="0" w:sz="0" w:val="nil"/>
+                <w:right w:space="0" w:sz="0" w:val="nil"/>
+                <w:between w:space="0" w:sz="0" w:val="nil"/>
+              </w:pBdr>
+              <w:shd w:fill="auto" w:val="clear"/>
+              <w:spacing w:after="0" w:before="0" w:line="240" w:lineRule="auto"/>
+              <w:ind w:left="0" w:right="0" w:firstLine="0"/>
+              <w:jc w:val="left"/>
+              <w:rPr>
+                <w:rFonts w:ascii="Times New Roman" w:cs="Times New Roman" w:eastAsia="Times New Roman" w:hAnsi="Times New Roman"/>
+              </w:rPr>
+            </w:pPr>
+            <w:r>
+              <w:rPr>
+                <w:rFonts w:ascii="Times New Roman" w:cs="Times New Roman" w:eastAsia="Times New Roman" w:hAnsi="Times New Roman"/>
+                <w:rtl w:val="0"/>
+              </w:rPr>
+              <w:t xml:space="preserve">Cross-Site Scripting </w:t>
+            </w:r>
+          </w:p>
+        </w:tc>
+        <w:tc>
+          <w:tcPr>
+            <w:shd w:fill="auto" w:val="clear"/>
+            <w:tcMar>
+              <w:top w:w="100.0" w:type="dxa"/>
+              <w:left w:w="100.0" w:type="dxa"/>
+              <w:bottom w:w="100.0" w:type="dxa"/>
+              <w:right w:w="100.0" w:type="dxa"/>
+            </w:tcMar>
+            <w:vAlign w:val="top"/>
+          </w:tcPr>
+          <w:p>
+            <w:pPr>
+              <w:keepNext w:val="0"/>
+              <w:keepLines w:val="0"/>
+              <w:pageBreakBefore w:val="0"/>
+              <w:widowControl w:val="0"/>
+              <w:pBdr>
+                <w:top w:space="0" w:sz="0" w:val="nil"/>
+                <w:left w:space="0" w:sz="0" w:val="nil"/>
+                <w:bottom w:space="0" w:sz="0" w:val="nil"/>
+                <w:right w:space="0" w:sz="0" w:val="nil"/>
+                <w:between w:space="0" w:sz="0" w:val="nil"/>
+              </w:pBdr>
+              <w:shd w:fill="auto" w:val="clear"/>
+              <w:spacing w:after="0" w:before="0" w:line="240" w:lineRule="auto"/>
+              <w:ind w:left="0" w:right="0" w:firstLine="0"/>
+              <w:jc w:val="left"/>
+              <w:rPr>
+                <w:rFonts w:ascii="Times New Roman" w:cs="Times New Roman" w:eastAsia="Times New Roman" w:hAnsi="Times New Roman"/>
+              </w:rPr>
+            </w:pPr>
+            <w:r>
+              <w:rPr>
+                <w:rFonts w:ascii="Times New Roman" w:cs="Times New Roman" w:eastAsia="Times New Roman" w:hAnsi="Times New Roman"/>
+                <w:rtl w:val="0"/>
+              </w:rPr>
+              <w:t xml:space="preserve">Malicious script can run in the browser </w:t>
+            </w:r>
+          </w:p>
+        </w:tc>
+      </w:tr>
+      <w:tr>
+        <w:trPr>
+          <w:cantSplit w:val="0"/>
+          <w:tblHeader w:val="0"/>
+        </w:trPr>
+        <w:tc>
+          <w:tcPr>
+            <w:shd w:fill="auto" w:val="clear"/>
+            <w:tcMar>
+              <w:top w:w="100.0" w:type="dxa"/>
+              <w:left w:w="100.0" w:type="dxa"/>
+              <w:bottom w:w="100.0" w:type="dxa"/>
+              <w:right w:w="100.0" w:type="dxa"/>
+            </w:tcMar>
+            <w:vAlign w:val="top"/>
+          </w:tcPr>
+          <w:p>
+            <w:pPr>
+              <w:keepNext w:val="0"/>
+              <w:keepLines w:val="0"/>
+              <w:pageBreakBefore w:val="0"/>
+              <w:widowControl w:val="0"/>
+              <w:pBdr>
+                <w:top w:space="0" w:sz="0" w:val="nil"/>
+                <w:left w:space="0" w:sz="0" w:val="nil"/>
+                <w:bottom w:space="0" w:sz="0" w:val="nil"/>
+                <w:right w:space="0" w:sz="0" w:val="nil"/>
+                <w:between w:space="0" w:sz="0" w:val="nil"/>
+              </w:pBdr>
+              <w:shd w:fill="auto" w:val="clear"/>
+              <w:spacing w:after="0" w:before="0" w:line="240" w:lineRule="auto"/>
+              <w:ind w:left="0" w:right="0" w:firstLine="0"/>
+              <w:jc w:val="left"/>
+              <w:rPr>
+                <w:rFonts w:ascii="Times New Roman" w:cs="Times New Roman" w:eastAsia="Times New Roman" w:hAnsi="Times New Roman"/>
+              </w:rPr>
+            </w:pPr>
+            <w:r>
+              <w:rPr>
+                <w:rFonts w:ascii="Times New Roman" w:cs="Times New Roman" w:eastAsia="Times New Roman" w:hAnsi="Times New Roman"/>
+                <w:rtl w:val="0"/>
+              </w:rPr>
+              <w:t xml:space="preserve">API response exposes password or password_hash </w:t>
+            </w:r>
+          </w:p>
+        </w:tc>
+        <w:tc>
+          <w:tcPr>
+            <w:shd w:fill="auto" w:val="clear"/>
+            <w:tcMar>
+              <w:top w:w="100.0" w:type="dxa"/>
+              <w:left w:w="100.0" w:type="dxa"/>
+              <w:bottom w:w="100.0" w:type="dxa"/>
+              <w:right w:w="100.0" w:type="dxa"/>
+            </w:tcMar>
+            <w:vAlign w:val="top"/>
+          </w:tcPr>
+          <w:p>
+            <w:pPr>
+              <w:keepNext w:val="0"/>
+              <w:keepLines w:val="0"/>
+              <w:pageBreakBefore w:val="0"/>
+              <w:widowControl w:val="0"/>
+              <w:pBdr>
+                <w:top w:space="0" w:sz="0" w:val="nil"/>
+                <w:left w:space="0" w:sz="0" w:val="nil"/>
+                <w:bottom w:space="0" w:sz="0" w:val="nil"/>
+                <w:right w:space="0" w:sz="0" w:val="nil"/>
+                <w:between w:space="0" w:sz="0" w:val="nil"/>
+              </w:pBdr>
+              <w:shd w:fill="auto" w:val="clear"/>
+              <w:spacing w:after="0" w:before="0" w:line="240" w:lineRule="auto"/>
+              <w:ind w:left="0" w:right="0" w:firstLine="0"/>
+              <w:jc w:val="left"/>
+              <w:rPr>
+                <w:rFonts w:ascii="Times New Roman" w:cs="Times New Roman" w:eastAsia="Times New Roman" w:hAnsi="Times New Roman"/>
+              </w:rPr>
+            </w:pPr>
+            <w:r>
+              <w:rPr>
+                <w:rFonts w:ascii="Times New Roman" w:cs="Times New Roman" w:eastAsia="Times New Roman" w:hAnsi="Times New Roman"/>
+                <w:rtl w:val="0"/>
+              </w:rPr>
+              <w:t xml:space="preserve">API / Backend </w:t>
+            </w:r>
+          </w:p>
+        </w:tc>
+        <w:tc>
+          <w:tcPr>
+            <w:shd w:fill="auto" w:val="clear"/>
+            <w:tcMar>
+              <w:top w:w="100.0" w:type="dxa"/>
+              <w:left w:w="100.0" w:type="dxa"/>
+              <w:bottom w:w="100.0" w:type="dxa"/>
+              <w:right w:w="100.0" w:type="dxa"/>
+            </w:tcMar>
+            <w:vAlign w:val="top"/>
+          </w:tcPr>
+          <w:p>
+            <w:pPr>
+              <w:keepNext w:val="0"/>
+              <w:keepLines w:val="0"/>
+              <w:pageBreakBefore w:val="0"/>
+              <w:widowControl w:val="0"/>
+              <w:pBdr>
+                <w:top w:space="0" w:sz="0" w:val="nil"/>
+                <w:left w:space="0" w:sz="0" w:val="nil"/>
+                <w:bottom w:space="0" w:sz="0" w:val="nil"/>
+                <w:right w:space="0" w:sz="0" w:val="nil"/>
+                <w:between w:space="0" w:sz="0" w:val="nil"/>
+              </w:pBdr>
+              <w:shd w:fill="auto" w:val="clear"/>
+              <w:spacing w:after="0" w:before="0" w:line="240" w:lineRule="auto"/>
+              <w:ind w:left="0" w:right="0" w:firstLine="0"/>
+              <w:jc w:val="left"/>
+              <w:rPr>
+                <w:rFonts w:ascii="Times New Roman" w:cs="Times New Roman" w:eastAsia="Times New Roman" w:hAnsi="Times New Roman"/>
+              </w:rPr>
+            </w:pPr>
+            <w:r>
+              <w:rPr>
+                <w:rFonts w:ascii="Times New Roman" w:cs="Times New Roman" w:eastAsia="Times New Roman" w:hAnsi="Times New Roman"/>
+                <w:rtl w:val="0"/>
+              </w:rPr>
+              <w:t xml:space="preserve">Sensitive Data Exposure </w:t>
+            </w:r>
+          </w:p>
+        </w:tc>
+        <w:tc>
+          <w:tcPr>
+            <w:shd w:fill="auto" w:val="clear"/>
+            <w:tcMar>
+              <w:top w:w="100.0" w:type="dxa"/>
+              <w:left w:w="100.0" w:type="dxa"/>
+              <w:bottom w:w="100.0" w:type="dxa"/>
+              <w:right w:w="100.0" w:type="dxa"/>
+            </w:tcMar>
+            <w:vAlign w:val="top"/>
+          </w:tcPr>
+          <w:p>
+            <w:pPr>
+              <w:keepNext w:val="0"/>
+              <w:keepLines w:val="0"/>
+              <w:pageBreakBefore w:val="0"/>
+              <w:widowControl w:val="0"/>
+              <w:pBdr>
+                <w:top w:space="0" w:sz="0" w:val="nil"/>
+                <w:left w:space="0" w:sz="0" w:val="nil"/>
+                <w:bottom w:space="0" w:sz="0" w:val="nil"/>
+                <w:right w:space="0" w:sz="0" w:val="nil"/>
+                <w:between w:space="0" w:sz="0" w:val="nil"/>
+              </w:pBdr>
+              <w:shd w:fill="auto" w:val="clear"/>
+              <w:spacing w:after="0" w:before="0" w:line="240" w:lineRule="auto"/>
+              <w:ind w:left="0" w:right="0" w:firstLine="0"/>
+              <w:jc w:val="left"/>
+              <w:rPr>
+                <w:rFonts w:ascii="Times New Roman" w:cs="Times New Roman" w:eastAsia="Times New Roman" w:hAnsi="Times New Roman"/>
+              </w:rPr>
+            </w:pPr>
+            <w:r>
+              <w:rPr>
+                <w:rFonts w:ascii="Times New Roman" w:cs="Times New Roman" w:eastAsia="Times New Roman" w:hAnsi="Times New Roman"/>
+                <w:rtl w:val="0"/>
+              </w:rPr>
+              <w:t xml:space="preserve">Sensitive user credential information may be exposed </w:t>
+            </w:r>
+          </w:p>
+        </w:tc>
+      </w:tr>
+      <w:tr>
+        <w:trPr>
+          <w:cantSplit w:val="0"/>
+          <w:tblHeader w:val="0"/>
+        </w:trPr>
+        <w:tc>
+          <w:tcPr>
+            <w:shd w:fill="auto" w:val="clear"/>
+            <w:tcMar>
+              <w:top w:w="100.0" w:type="dxa"/>
+              <w:left w:w="100.0" w:type="dxa"/>
+              <w:bottom w:w="100.0" w:type="dxa"/>
+              <w:right w:w="100.0" w:type="dxa"/>
+            </w:tcMar>
+            <w:vAlign w:val="top"/>
+          </w:tcPr>
+          <w:p>
+            <w:pPr>
+              <w:keepNext w:val="0"/>
+              <w:keepLines w:val="0"/>
+              <w:pageBreakBefore w:val="0"/>
+              <w:widowControl w:val="0"/>
+              <w:pBdr>
+                <w:top w:space="0" w:sz="0" w:val="nil"/>
+                <w:left w:space="0" w:sz="0" w:val="nil"/>
+                <w:bottom w:space="0" w:sz="0" w:val="nil"/>
+                <w:right w:space="0" w:sz="0" w:val="nil"/>
+                <w:between w:space="0" w:sz="0" w:val="nil"/>
+              </w:pBdr>
+              <w:shd w:fill="auto" w:val="clear"/>
+              <w:spacing w:after="0" w:before="0" w:line="240" w:lineRule="auto"/>
+              <w:ind w:left="0" w:right="0" w:firstLine="0"/>
+              <w:jc w:val="left"/>
+              <w:rPr>
+                <w:rFonts w:ascii="Times New Roman" w:cs="Times New Roman" w:eastAsia="Times New Roman" w:hAnsi="Times New Roman"/>
+              </w:rPr>
+            </w:pPr>
+            <w:r>
+              <w:rPr>
+                <w:rFonts w:ascii="Times New Roman" w:cs="Times New Roman" w:eastAsia="Times New Roman" w:hAnsi="Times New Roman"/>
+                <w:rtl w:val="0"/>
+              </w:rPr>
+              <w:t xml:space="preserve">SQL Injection input may affect query </w:t>
+            </w:r>
+          </w:p>
+        </w:tc>
+        <w:tc>
+          <w:tcPr>
+            <w:shd w:fill="auto" w:val="clear"/>
+            <w:tcMar>
+              <w:top w:w="100.0" w:type="dxa"/>
+              <w:left w:w="100.0" w:type="dxa"/>
+              <w:bottom w:w="100.0" w:type="dxa"/>
+              <w:right w:w="100.0" w:type="dxa"/>
+            </w:tcMar>
+            <w:vAlign w:val="top"/>
+          </w:tcPr>
+          <w:p>
+            <w:pPr>
+              <w:keepNext w:val="0"/>
+              <w:keepLines w:val="0"/>
+              <w:pageBreakBefore w:val="0"/>
+              <w:widowControl w:val="0"/>
+              <w:pBdr>
+                <w:top w:space="0" w:sz="0" w:val="nil"/>
+                <w:left w:space="0" w:sz="0" w:val="nil"/>
+                <w:bottom w:space="0" w:sz="0" w:val="nil"/>
+                <w:right w:space="0" w:sz="0" w:val="nil"/>
+                <w:between w:space="0" w:sz="0" w:val="nil"/>
+              </w:pBdr>
+              <w:shd w:fill="auto" w:val="clear"/>
+              <w:spacing w:after="0" w:before="0" w:line="240" w:lineRule="auto"/>
+              <w:ind w:left="0" w:right="0" w:firstLine="0"/>
+              <w:jc w:val="left"/>
+              <w:rPr>
+                <w:rFonts w:ascii="Times New Roman" w:cs="Times New Roman" w:eastAsia="Times New Roman" w:hAnsi="Times New Roman"/>
+              </w:rPr>
+            </w:pPr>
+            <w:r>
+              <w:rPr>
+                <w:rFonts w:ascii="Times New Roman" w:cs="Times New Roman" w:eastAsia="Times New Roman" w:hAnsi="Times New Roman"/>
+                <w:rtl w:val="0"/>
+              </w:rPr>
+              <w:t xml:space="preserve">Backend / Database </w:t>
+            </w:r>
+          </w:p>
+        </w:tc>
+        <w:tc>
+          <w:tcPr>
+            <w:shd w:fill="auto" w:val="clear"/>
+            <w:tcMar>
+              <w:top w:w="100.0" w:type="dxa"/>
+              <w:left w:w="100.0" w:type="dxa"/>
+              <w:bottom w:w="100.0" w:type="dxa"/>
+              <w:right w:w="100.0" w:type="dxa"/>
+            </w:tcMar>
+            <w:vAlign w:val="top"/>
+          </w:tcPr>
+          <w:p>
+            <w:pPr>
+              <w:keepNext w:val="0"/>
+              <w:keepLines w:val="0"/>
+              <w:pageBreakBefore w:val="0"/>
+              <w:widowControl w:val="0"/>
+              <w:pBdr>
+                <w:top w:space="0" w:sz="0" w:val="nil"/>
+                <w:left w:space="0" w:sz="0" w:val="nil"/>
+                <w:bottom w:space="0" w:sz="0" w:val="nil"/>
+                <w:right w:space="0" w:sz="0" w:val="nil"/>
+                <w:between w:space="0" w:sz="0" w:val="nil"/>
+              </w:pBdr>
+              <w:shd w:fill="auto" w:val="clear"/>
+              <w:spacing w:after="0" w:before="0" w:line="240" w:lineRule="auto"/>
+              <w:ind w:left="0" w:right="0" w:firstLine="0"/>
+              <w:jc w:val="left"/>
+              <w:rPr>
+                <w:rFonts w:ascii="Times New Roman" w:cs="Times New Roman" w:eastAsia="Times New Roman" w:hAnsi="Times New Roman"/>
+              </w:rPr>
+            </w:pPr>
+            <w:r>
+              <w:rPr>
+                <w:rFonts w:ascii="Times New Roman" w:cs="Times New Roman" w:eastAsia="Times New Roman" w:hAnsi="Times New Roman"/>
+                <w:rtl w:val="0"/>
+              </w:rPr>
+              <w:t xml:space="preserve">SQL Injection </w:t>
+            </w:r>
+          </w:p>
+        </w:tc>
+        <w:tc>
+          <w:tcPr>
+            <w:shd w:fill="auto" w:val="clear"/>
+            <w:tcMar>
+              <w:top w:w="100.0" w:type="dxa"/>
+              <w:left w:w="100.0" w:type="dxa"/>
+              <w:bottom w:w="100.0" w:type="dxa"/>
+              <w:right w:w="100.0" w:type="dxa"/>
+            </w:tcMar>
+            <w:vAlign w:val="top"/>
+          </w:tcPr>
+          <w:p>
+            <w:pPr>
+              <w:keepNext w:val="0"/>
+              <w:keepLines w:val="0"/>
+              <w:pageBreakBefore w:val="0"/>
+              <w:widowControl w:val="0"/>
+              <w:pBdr>
+                <w:top w:space="0" w:sz="0" w:val="nil"/>
+                <w:left w:space="0" w:sz="0" w:val="nil"/>
+                <w:bottom w:space="0" w:sz="0" w:val="nil"/>
+                <w:right w:space="0" w:sz="0" w:val="nil"/>
+                <w:between w:space="0" w:sz="0" w:val="nil"/>
+              </w:pBdr>
+              <w:shd w:fill="auto" w:val="clear"/>
+              <w:spacing w:after="0" w:before="0" w:line="240" w:lineRule="auto"/>
+              <w:ind w:left="0" w:right="0" w:firstLine="0"/>
+              <w:jc w:val="left"/>
+              <w:rPr>
+                <w:rFonts w:ascii="Times New Roman" w:cs="Times New Roman" w:eastAsia="Times New Roman" w:hAnsi="Times New Roman"/>
+              </w:rPr>
+            </w:pPr>
+            <w:r>
+              <w:rPr>
+                <w:rFonts w:ascii="Times New Roman" w:cs="Times New Roman" w:eastAsia="Times New Roman" w:hAnsi="Times New Roman"/>
+                <w:rtl w:val="0"/>
+              </w:rPr>
+              <w:t xml:space="preserve">Unauthorized access or database query manipulation may happen </w:t>
+            </w:r>
+          </w:p>
+        </w:tc>
+      </w:tr>
+      <w:tr>
+        <w:trPr>
+          <w:cantSplit w:val="0"/>
+          <w:tblHeader w:val="0"/>
+        </w:trPr>
+        <w:tc>
+          <w:tcPr>
+            <w:shd w:fill="auto" w:val="clear"/>
+            <w:tcMar>
+              <w:top w:w="100.0" w:type="dxa"/>
+              <w:left w:w="100.0" w:type="dxa"/>
+              <w:bottom w:w="100.0" w:type="dxa"/>
+              <w:right w:w="100.0" w:type="dxa"/>
+            </w:tcMar>
+            <w:vAlign w:val="top"/>
+          </w:tcPr>
+          <w:p>
+            <w:pPr>
+              <w:keepNext w:val="0"/>
+              <w:keepLines w:val="0"/>
+              <w:pageBreakBefore w:val="0"/>
+              <w:widowControl w:val="0"/>
+              <w:pBdr>
+                <w:top w:space="0" w:sz="0" w:val="nil"/>
+                <w:left w:space="0" w:sz="0" w:val="nil"/>
+                <w:bottom w:space="0" w:sz="0" w:val="nil"/>
+                <w:right w:space="0" w:sz="0" w:val="nil"/>
+                <w:between w:space="0" w:sz="0" w:val="nil"/>
+              </w:pBdr>
+              <w:shd w:fill="auto" w:val="clear"/>
+              <w:spacing w:after="0" w:before="0" w:line="240" w:lineRule="auto"/>
+              <w:ind w:left="0" w:right="0" w:firstLine="0"/>
+              <w:jc w:val="left"/>
+              <w:rPr>
+                <w:rFonts w:ascii="Times New Roman" w:cs="Times New Roman" w:eastAsia="Times New Roman" w:hAnsi="Times New Roman"/>
+              </w:rPr>
+            </w:pPr>
+            <w:r>
+              <w:rPr>
+                <w:rFonts w:ascii="Times New Roman" w:cs="Times New Roman" w:eastAsia="Times New Roman" w:hAnsi="Times New Roman"/>
+                <w:rtl w:val="0"/>
+              </w:rPr>
+              <w:t xml:space="preserve">User can update protected fields </w:t>
+            </w:r>
+          </w:p>
+        </w:tc>
+        <w:tc>
+          <w:tcPr>
+            <w:shd w:fill="auto" w:val="clear"/>
+            <w:tcMar>
+              <w:top w:w="100.0" w:type="dxa"/>
+              <w:left w:w="100.0" w:type="dxa"/>
+              <w:bottom w:w="100.0" w:type="dxa"/>
+              <w:right w:w="100.0" w:type="dxa"/>
+            </w:tcMar>
+            <w:vAlign w:val="top"/>
+          </w:tcPr>
+          <w:p>
+            <w:pPr>
+              <w:keepNext w:val="0"/>
+              <w:keepLines w:val="0"/>
+              <w:pageBreakBefore w:val="0"/>
+              <w:widowControl w:val="0"/>
+              <w:pBdr>
+                <w:top w:space="0" w:sz="0" w:val="nil"/>
+                <w:left w:space="0" w:sz="0" w:val="nil"/>
+                <w:bottom w:space="0" w:sz="0" w:val="nil"/>
+                <w:right w:space="0" w:sz="0" w:val="nil"/>
+                <w:between w:space="0" w:sz="0" w:val="nil"/>
+              </w:pBdr>
+              <w:shd w:fill="auto" w:val="clear"/>
+              <w:spacing w:after="0" w:before="0" w:line="240" w:lineRule="auto"/>
+              <w:ind w:left="0" w:right="0" w:firstLine="0"/>
+              <w:jc w:val="left"/>
+              <w:rPr>
+                <w:rFonts w:ascii="Times New Roman" w:cs="Times New Roman" w:eastAsia="Times New Roman" w:hAnsi="Times New Roman"/>
+              </w:rPr>
+            </w:pPr>
+            <w:r>
+              <w:rPr>
+                <w:rFonts w:ascii="Times New Roman" w:cs="Times New Roman" w:eastAsia="Times New Roman" w:hAnsi="Times New Roman"/>
+                <w:rtl w:val="0"/>
+              </w:rPr>
+              <w:t xml:space="preserve">API / Backend </w:t>
+            </w:r>
+          </w:p>
+        </w:tc>
+        <w:tc>
+          <w:tcPr>
+            <w:shd w:fill="auto" w:val="clear"/>
+            <w:tcMar>
+              <w:top w:w="100.0" w:type="dxa"/>
+              <w:left w:w="100.0" w:type="dxa"/>
+              <w:bottom w:w="100.0" w:type="dxa"/>
+              <w:right w:w="100.0" w:type="dxa"/>
+            </w:tcMar>
+            <w:vAlign w:val="top"/>
+          </w:tcPr>
+          <w:p>
+            <w:pPr>
+              <w:keepNext w:val="0"/>
+              <w:keepLines w:val="0"/>
+              <w:pageBreakBefore w:val="0"/>
+              <w:widowControl w:val="0"/>
+              <w:pBdr>
+                <w:top w:space="0" w:sz="0" w:val="nil"/>
+                <w:left w:space="0" w:sz="0" w:val="nil"/>
+                <w:bottom w:space="0" w:sz="0" w:val="nil"/>
+                <w:right w:space="0" w:sz="0" w:val="nil"/>
+                <w:between w:space="0" w:sz="0" w:val="nil"/>
+              </w:pBdr>
+              <w:shd w:fill="auto" w:val="clear"/>
+              <w:spacing w:after="0" w:before="0" w:line="240" w:lineRule="auto"/>
+              <w:ind w:left="0" w:right="0" w:firstLine="0"/>
+              <w:jc w:val="left"/>
+              <w:rPr>
+                <w:rFonts w:ascii="Times New Roman" w:cs="Times New Roman" w:eastAsia="Times New Roman" w:hAnsi="Times New Roman"/>
+              </w:rPr>
+            </w:pPr>
+            <w:r>
+              <w:rPr>
+                <w:rFonts w:ascii="Times New Roman" w:cs="Times New Roman" w:eastAsia="Times New Roman" w:hAnsi="Times New Roman"/>
+                <w:rtl w:val="0"/>
+              </w:rPr>
+              <w:t xml:space="preserve">Mass Assignment </w:t>
+            </w:r>
+          </w:p>
+        </w:tc>
+        <w:tc>
+          <w:tcPr>
+            <w:shd w:fill="auto" w:val="clear"/>
+            <w:tcMar>
+              <w:top w:w="100.0" w:type="dxa"/>
+              <w:left w:w="100.0" w:type="dxa"/>
+              <w:bottom w:w="100.0" w:type="dxa"/>
+              <w:right w:w="100.0" w:type="dxa"/>
+            </w:tcMar>
+            <w:vAlign w:val="top"/>
+          </w:tcPr>
+          <w:p>
+            <w:pPr>
+              <w:keepNext w:val="0"/>
+              <w:keepLines w:val="0"/>
+              <w:pageBreakBefore w:val="0"/>
+              <w:widowControl w:val="0"/>
+              <w:pBdr>
+                <w:top w:space="0" w:sz="0" w:val="nil"/>
+                <w:left w:space="0" w:sz="0" w:val="nil"/>
+                <w:bottom w:space="0" w:sz="0" w:val="nil"/>
+                <w:right w:space="0" w:sz="0" w:val="nil"/>
+                <w:between w:space="0" w:sz="0" w:val="nil"/>
+              </w:pBdr>
+              <w:shd w:fill="auto" w:val="clear"/>
+              <w:spacing w:after="0" w:before="0" w:line="240" w:lineRule="auto"/>
+              <w:ind w:left="0" w:right="0" w:firstLine="0"/>
+              <w:jc w:val="left"/>
+              <w:rPr>
+                <w:rFonts w:ascii="Times New Roman" w:cs="Times New Roman" w:eastAsia="Times New Roman" w:hAnsi="Times New Roman"/>
+              </w:rPr>
+            </w:pPr>
+            <w:r>
+              <w:rPr>
+                <w:rFonts w:ascii="Times New Roman" w:cs="Times New Roman" w:eastAsia="Times New Roman" w:hAnsi="Times New Roman"/>
+                <w:rtl w:val="0"/>
+              </w:rPr>
+              <w:t xml:space="preserve">User may change fields such as user_id, role, bmi, or category </w:t>
+            </w:r>
+          </w:p>
+        </w:tc>
+      </w:tr>
+    </w:tbl>
+    <w:p>
+      <w:pPr>
+        <w:spacing w:after="200" w:line="276" w:lineRule="auto"/>
+        <w:jc w:val="left"/>
+        <w:rPr>
+          <w:rFonts w:ascii="Times New Roman" w:cs="Times New Roman" w:eastAsia="Times New Roman" w:hAnsi="Times New Roman"/>
+          <w:b w:val="1"/>
+          <w:bCs w:val="1"/>
         </w:rPr>
       </w:pPr>
       <w:r>
@@ -4756,6 +6377,13 @@
     </w:tblPr>
   </w:style>
   <w:style w:type="table" w:styleId="Table3">
+    <w:basedOn w:val="TableNormal"/>
+    <w:tblPr>
+      <w:tblStyleRowBandSize w:val="1"/>
+      <w:tblStyleColBandSize w:val="1"/>
+    </w:tblPr>
+  </w:style>
+  <w:style w:type="table" w:styleId="Table4">
     <w:basedOn w:val="TableNormal"/>
     <w:tblPr>
       <w:tblStyleRowBandSize w:val="1"/>

</xml_diff>

<commit_message>
Add phase 3 problem solution mapping
</commit_message>
<xml_diff>
--- a/report/SECJ3483-01_Izzat_Ammar_Rami_Nour.docx
+++ b/report/SECJ3483-01_Izzat_Ammar_Rami_Nour.docx
@@ -781,8 +781,6 @@
         <w:jc w:val="left"/>
         <w:rPr>
           <w:rFonts w:ascii="Times New Roman" w:cs="Times New Roman" w:eastAsia="Times New Roman" w:hAnsi="Times New Roman"/>
-          <w:b w:val="1"/>
-          <w:bCs w:val="1"/>
         </w:rPr>
       </w:pPr>
       <w:r>
@@ -792,23 +790,12 @@
           <w:bCs w:val="1"/>
           <w:rtl w:val="0"/>
         </w:rPr>
-        <w:t xml:space="preserve">Phase 1</w:t>
+        <w:t xml:space="preserve">Phase 1: Security Investigation</w:t>
       </w:r>
-    </w:p>
-    <w:p>
-      <w:pPr>
-        <w:spacing w:after="200" w:line="276" w:lineRule="auto"/>
-        <w:jc w:val="left"/>
-        <w:rPr>
-          <w:rFonts w:ascii="Times New Roman" w:cs="Times New Roman" w:eastAsia="Times New Roman" w:hAnsi="Times New Roman"/>
-        </w:rPr>
-      </w:pPr>
       <w:r>
         <w:rPr>
-          <w:rFonts w:ascii="Times New Roman" w:cs="Times New Roman" w:eastAsia="Times New Roman" w:hAnsi="Times New Roman"/>
           <w:rtl w:val="0"/>
         </w:rPr>
-        <w:t xml:space="preserve">2. Security investigation summary </w:t>
       </w:r>
     </w:p>
     <w:p>
@@ -3547,12 +3534,12 @@
                 <wp:inline distB="114300" distT="114300" distL="114300" distR="114300">
                   <wp:extent cx="2519363" cy="1548525"/>
                   <wp:effectExtent b="0" l="0" r="0" t="0"/>
-                  <wp:docPr id="2" name="image3.png"/>
+                  <wp:docPr id="2" name="image1.png"/>
                   <a:graphic>
                     <a:graphicData uri="http://schemas.openxmlformats.org/drawingml/2006/picture">
                       <pic:pic>
                         <pic:nvPicPr>
-                          <pic:cNvPr id="0" name="image3.png"/>
+                          <pic:cNvPr id="0" name="image1.png"/>
                           <pic:cNvPicPr preferRelativeResize="0"/>
                         </pic:nvPicPr>
                         <pic:blipFill>
@@ -3584,12 +3571,12 @@
                 <wp:inline distB="114300" distT="114300" distL="114300" distR="114300">
                   <wp:extent cx="2114550" cy="1728788"/>
                   <wp:effectExtent b="0" l="0" r="0" t="0"/>
-                  <wp:docPr id="11" name="image6.png"/>
+                  <wp:docPr id="11" name="image8.png"/>
                   <a:graphic>
                     <a:graphicData uri="http://schemas.openxmlformats.org/drawingml/2006/picture">
                       <pic:pic>
                         <pic:nvPicPr>
-                          <pic:cNvPr id="0" name="image6.png"/>
+                          <pic:cNvPr id="0" name="image8.png"/>
                           <pic:cNvPicPr preferRelativeResize="0"/>
                         </pic:nvPicPr>
                         <pic:blipFill>
@@ -3707,12 +3694,12 @@
                 <wp:inline distB="114300" distT="114300" distL="114300" distR="114300">
                   <wp:extent cx="2240833" cy="1692331"/>
                   <wp:effectExtent b="0" l="0" r="0" t="0"/>
-                  <wp:docPr id="5" name="image1.png"/>
+                  <wp:docPr id="5" name="image5.png"/>
                   <a:graphic>
                     <a:graphicData uri="http://schemas.openxmlformats.org/drawingml/2006/picture">
                       <pic:pic>
                         <pic:nvPicPr>
-                          <pic:cNvPr id="0" name="image1.png"/>
+                          <pic:cNvPr id="0" name="image5.png"/>
                           <pic:cNvPicPr preferRelativeResize="0"/>
                         </pic:nvPicPr>
                         <pic:blipFill>
@@ -3830,12 +3817,12 @@
                 <wp:inline distB="114300" distT="114300" distL="114300" distR="114300">
                   <wp:extent cx="2551655" cy="1804988"/>
                   <wp:effectExtent b="0" l="0" r="0" t="0"/>
-                  <wp:docPr id="6" name="image4.png"/>
+                  <wp:docPr id="6" name="image7.png"/>
                   <a:graphic>
                     <a:graphicData uri="http://schemas.openxmlformats.org/drawingml/2006/picture">
                       <pic:pic>
                         <pic:nvPicPr>
-                          <pic:cNvPr id="0" name="image4.png"/>
+                          <pic:cNvPr id="0" name="image7.png"/>
                           <pic:cNvPicPr preferRelativeResize="0"/>
                         </pic:nvPicPr>
                         <pic:blipFill>
@@ -3953,12 +3940,12 @@
                 <wp:inline distB="114300" distT="114300" distL="114300" distR="114300">
                   <wp:extent cx="3474927" cy="2328863"/>
                   <wp:effectExtent b="0" l="0" r="0" t="0"/>
-                  <wp:docPr id="3" name="image8.png"/>
+                  <wp:docPr id="3" name="image2.png"/>
                   <a:graphic>
                     <a:graphicData uri="http://schemas.openxmlformats.org/drawingml/2006/picture">
                       <pic:pic>
                         <pic:nvPicPr>
-                          <pic:cNvPr id="0" name="image8.png"/>
+                          <pic:cNvPr id="0" name="image2.png"/>
                           <pic:cNvPicPr preferRelativeResize="0"/>
                         </pic:nvPicPr>
                         <pic:blipFill>
@@ -4236,12 +4223,12 @@
                 <wp:inline distB="114300" distT="114300" distL="114300" distR="114300">
                   <wp:extent cx="3033713" cy="2033349"/>
                   <wp:effectExtent b="0" l="0" r="0" t="0"/>
-                  <wp:docPr id="1" name="image5.png"/>
+                  <wp:docPr id="1" name="image3.png"/>
                   <a:graphic>
                     <a:graphicData uri="http://schemas.openxmlformats.org/drawingml/2006/picture">
                       <pic:pic>
                         <pic:nvPicPr>
-                          <pic:cNvPr id="0" name="image5.png"/>
+                          <pic:cNvPr id="0" name="image3.png"/>
                           <pic:cNvPicPr preferRelativeResize="0"/>
                         </pic:nvPicPr>
                         <pic:blipFill>
@@ -4359,12 +4346,12 @@
                 <wp:inline distB="114300" distT="114300" distL="114300" distR="114300">
                   <wp:extent cx="3017822" cy="2006656"/>
                   <wp:effectExtent b="0" l="0" r="0" t="0"/>
-                  <wp:docPr id="7" name="image2.png"/>
+                  <wp:docPr id="7" name="image6.png"/>
                   <a:graphic>
                     <a:graphicData uri="http://schemas.openxmlformats.org/drawingml/2006/picture">
                       <pic:pic>
                         <pic:nvPicPr>
-                          <pic:cNvPr id="0" name="image2.png"/>
+                          <pic:cNvPr id="0" name="image6.png"/>
                           <pic:cNvPicPr preferRelativeResize="0"/>
                         </pic:nvPicPr>
                         <pic:blipFill>
@@ -4482,12 +4469,12 @@
                 <wp:inline distB="114300" distT="114300" distL="114300" distR="114300">
                   <wp:extent cx="3407423" cy="2090738"/>
                   <wp:effectExtent b="0" l="0" r="0" t="0"/>
-                  <wp:docPr id="4" name="image7.png"/>
+                  <wp:docPr id="4" name="image4.png"/>
                   <a:graphic>
                     <a:graphicData uri="http://schemas.openxmlformats.org/drawingml/2006/picture">
                       <pic:pic>
                         <pic:nvPicPr>
-                          <pic:cNvPr id="0" name="image7.png"/>
+                          <pic:cNvPr id="0" name="image4.png"/>
                           <pic:cNvPicPr preferRelativeResize="0"/>
                         </pic:nvPicPr>
                         <pic:blipFill>
@@ -4572,7 +4559,7 @@
           <w:bCs w:val="1"/>
           <w:rtl w:val="0"/>
         </w:rPr>
-        <w:t xml:space="preserve">Phase 2</w:t>
+        <w:t xml:space="preserve">Phase 2: Weakness Classification and Discussion</w:t>
       </w:r>
     </w:p>
     <w:p>
@@ -6163,6 +6150,2106 @@
                 <w:rtl w:val="0"/>
               </w:rPr>
               <w:t xml:space="preserve">User may change fields such as user_id, role, bmi, or category </w:t>
+            </w:r>
+          </w:p>
+        </w:tc>
+      </w:tr>
+    </w:tbl>
+    <w:p>
+      <w:pPr>
+        <w:spacing w:after="200" w:line="276" w:lineRule="auto"/>
+        <w:jc w:val="left"/>
+        <w:rPr>
+          <w:rFonts w:ascii="Times New Roman" w:cs="Times New Roman" w:eastAsia="Times New Roman" w:hAnsi="Times New Roman"/>
+          <w:b w:val="1"/>
+          <w:bCs w:val="1"/>
+        </w:rPr>
+      </w:pPr>
+      <w:r>
+        <w:rPr>
+          <w:rtl w:val="0"/>
+        </w:rPr>
+      </w:r>
+    </w:p>
+    <w:p>
+      <w:pPr>
+        <w:spacing w:after="200" w:line="276" w:lineRule="auto"/>
+        <w:jc w:val="left"/>
+        <w:rPr>
+          <w:rFonts w:ascii="Times New Roman" w:cs="Times New Roman" w:eastAsia="Times New Roman" w:hAnsi="Times New Roman"/>
+          <w:b w:val="1"/>
+          <w:bCs w:val="1"/>
+        </w:rPr>
+      </w:pPr>
+      <w:r>
+        <w:rPr>
+          <w:rtl w:val="0"/>
+        </w:rPr>
+      </w:r>
+    </w:p>
+    <w:p>
+      <w:pPr>
+        <w:spacing w:after="200" w:line="276" w:lineRule="auto"/>
+        <w:jc w:val="left"/>
+        <w:rPr>
+          <w:rFonts w:ascii="Times New Roman" w:cs="Times New Roman" w:eastAsia="Times New Roman" w:hAnsi="Times New Roman"/>
+          <w:b w:val="1"/>
+          <w:bCs w:val="1"/>
+        </w:rPr>
+      </w:pPr>
+      <w:r>
+        <w:rPr>
+          <w:rtl w:val="0"/>
+        </w:rPr>
+      </w:r>
+    </w:p>
+    <w:p>
+      <w:pPr>
+        <w:spacing w:after="200" w:line="276" w:lineRule="auto"/>
+        <w:jc w:val="left"/>
+        <w:rPr>
+          <w:rFonts w:ascii="Times New Roman" w:cs="Times New Roman" w:eastAsia="Times New Roman" w:hAnsi="Times New Roman"/>
+          <w:b w:val="1"/>
+          <w:bCs w:val="1"/>
+        </w:rPr>
+      </w:pPr>
+      <w:r>
+        <w:rPr>
+          <w:rtl w:val="0"/>
+        </w:rPr>
+      </w:r>
+    </w:p>
+    <w:p>
+      <w:pPr>
+        <w:spacing w:after="200" w:line="276" w:lineRule="auto"/>
+        <w:jc w:val="left"/>
+        <w:rPr>
+          <w:rFonts w:ascii="Times New Roman" w:cs="Times New Roman" w:eastAsia="Times New Roman" w:hAnsi="Times New Roman"/>
+          <w:b w:val="1"/>
+          <w:bCs w:val="1"/>
+        </w:rPr>
+      </w:pPr>
+      <w:r>
+        <w:rPr>
+          <w:rtl w:val="0"/>
+        </w:rPr>
+      </w:r>
+    </w:p>
+    <w:p>
+      <w:pPr>
+        <w:spacing w:after="200" w:line="276" w:lineRule="auto"/>
+        <w:jc w:val="left"/>
+        <w:rPr>
+          <w:rFonts w:ascii="Times New Roman" w:cs="Times New Roman" w:eastAsia="Times New Roman" w:hAnsi="Times New Roman"/>
+          <w:b w:val="1"/>
+          <w:bCs w:val="1"/>
+        </w:rPr>
+      </w:pPr>
+      <w:r>
+        <w:rPr>
+          <w:rtl w:val="0"/>
+        </w:rPr>
+      </w:r>
+    </w:p>
+    <w:p>
+      <w:pPr>
+        <w:spacing w:after="200" w:line="276" w:lineRule="auto"/>
+        <w:jc w:val="left"/>
+        <w:rPr>
+          <w:rFonts w:ascii="Times New Roman" w:cs="Times New Roman" w:eastAsia="Times New Roman" w:hAnsi="Times New Roman"/>
+          <w:b w:val="1"/>
+          <w:bCs w:val="1"/>
+        </w:rPr>
+      </w:pPr>
+      <w:r>
+        <w:rPr>
+          <w:rtl w:val="0"/>
+        </w:rPr>
+      </w:r>
+    </w:p>
+    <w:p>
+      <w:pPr>
+        <w:spacing w:after="200" w:line="276" w:lineRule="auto"/>
+        <w:jc w:val="left"/>
+        <w:rPr>
+          <w:rFonts w:ascii="Times New Roman" w:cs="Times New Roman" w:eastAsia="Times New Roman" w:hAnsi="Times New Roman"/>
+          <w:b w:val="1"/>
+          <w:bCs w:val="1"/>
+        </w:rPr>
+      </w:pPr>
+      <w:r>
+        <w:rPr>
+          <w:rFonts w:ascii="Times New Roman" w:cs="Times New Roman" w:eastAsia="Times New Roman" w:hAnsi="Times New Roman"/>
+          <w:b w:val="1"/>
+          <w:bCs w:val="1"/>
+          <w:rtl w:val="0"/>
+        </w:rPr>
+        <w:t xml:space="preserve">Phase 3 : Problem-Solution Mapping</w:t>
+      </w:r>
+    </w:p>
+    <w:p>
+      <w:pPr>
+        <w:spacing w:after="200" w:line="276" w:lineRule="auto"/>
+        <w:jc w:val="left"/>
+        <w:rPr>
+          <w:rFonts w:ascii="Times New Roman" w:cs="Times New Roman" w:eastAsia="Times New Roman" w:hAnsi="Times New Roman"/>
+          <w:b w:val="1"/>
+          <w:bCs w:val="1"/>
+        </w:rPr>
+      </w:pPr>
+      <w:r>
+        <w:rPr>
+          <w:rtl w:val="0"/>
+        </w:rPr>
+      </w:r>
+    </w:p>
+    <w:tbl>
+      <w:tblPr>
+        <w:tblStyle w:val="Table5"/>
+        <w:tblW w:w="9360.0" w:type="dxa"/>
+        <w:jc w:val="left"/>
+        <w:tblBorders>
+          <w:top w:color="000000" w:space="0" w:sz="8" w:val="single"/>
+          <w:left w:color="000000" w:space="0" w:sz="8" w:val="single"/>
+          <w:bottom w:color="000000" w:space="0" w:sz="8" w:val="single"/>
+          <w:right w:color="000000" w:space="0" w:sz="8" w:val="single"/>
+          <w:insideH w:color="000000" w:space="0" w:sz="8" w:val="single"/>
+          <w:insideV w:color="000000" w:space="0" w:sz="8" w:val="single"/>
+        </w:tblBorders>
+        <w:tblLayout w:type="fixed"/>
+        <w:tblLook w:val="0600"/>
+      </w:tblPr>
+      <w:tblGrid>
+        <w:gridCol w:w="1872"/>
+        <w:gridCol w:w="1872"/>
+        <w:gridCol w:w="1872"/>
+        <w:gridCol w:w="1872"/>
+        <w:gridCol w:w="1872"/>
+        <w:tblGridChange w:id="0">
+          <w:tblGrid>
+            <w:gridCol w:w="1872"/>
+            <w:gridCol w:w="1872"/>
+            <w:gridCol w:w="1872"/>
+            <w:gridCol w:w="1872"/>
+            <w:gridCol w:w="1872"/>
+          </w:tblGrid>
+        </w:tblGridChange>
+      </w:tblGrid>
+      <w:tr>
+        <w:trPr>
+          <w:cantSplit w:val="0"/>
+          <w:tblHeader w:val="0"/>
+        </w:trPr>
+        <w:tc>
+          <w:tcPr>
+            <w:shd w:fill="auto" w:val="clear"/>
+            <w:tcMar>
+              <w:top w:w="100.0" w:type="dxa"/>
+              <w:left w:w="100.0" w:type="dxa"/>
+              <w:bottom w:w="100.0" w:type="dxa"/>
+              <w:right w:w="100.0" w:type="dxa"/>
+            </w:tcMar>
+            <w:vAlign w:val="top"/>
+          </w:tcPr>
+          <w:p>
+            <w:pPr>
+              <w:keepNext w:val="0"/>
+              <w:keepLines w:val="0"/>
+              <w:pageBreakBefore w:val="0"/>
+              <w:widowControl w:val="0"/>
+              <w:pBdr>
+                <w:top w:space="0" w:sz="0" w:val="nil"/>
+                <w:left w:space="0" w:sz="0" w:val="nil"/>
+                <w:bottom w:space="0" w:sz="0" w:val="nil"/>
+                <w:right w:space="0" w:sz="0" w:val="nil"/>
+                <w:between w:space="0" w:sz="0" w:val="nil"/>
+              </w:pBdr>
+              <w:shd w:fill="auto" w:val="clear"/>
+              <w:spacing w:after="0" w:before="0" w:line="240" w:lineRule="auto"/>
+              <w:ind w:left="0" w:right="0" w:firstLine="0"/>
+              <w:jc w:val="left"/>
+              <w:rPr>
+                <w:rFonts w:ascii="Times New Roman" w:cs="Times New Roman" w:eastAsia="Times New Roman" w:hAnsi="Times New Roman"/>
+                <w:b w:val="1"/>
+                <w:bCs w:val="1"/>
+              </w:rPr>
+            </w:pPr>
+            <w:r>
+              <w:rPr>
+                <w:rFonts w:ascii="Times New Roman" w:cs="Times New Roman" w:eastAsia="Times New Roman" w:hAnsi="Times New Roman"/>
+                <w:b w:val="1"/>
+                <w:bCs w:val="1"/>
+                <w:rtl w:val="0"/>
+              </w:rPr>
+              <w:t xml:space="preserve">Problem </w:t>
+            </w:r>
+          </w:p>
+        </w:tc>
+        <w:tc>
+          <w:tcPr>
+            <w:shd w:fill="auto" w:val="clear"/>
+            <w:tcMar>
+              <w:top w:w="100.0" w:type="dxa"/>
+              <w:left w:w="100.0" w:type="dxa"/>
+              <w:bottom w:w="100.0" w:type="dxa"/>
+              <w:right w:w="100.0" w:type="dxa"/>
+            </w:tcMar>
+            <w:vAlign w:val="top"/>
+          </w:tcPr>
+          <w:p>
+            <w:pPr>
+              <w:keepNext w:val="0"/>
+              <w:keepLines w:val="0"/>
+              <w:pageBreakBefore w:val="0"/>
+              <w:widowControl w:val="0"/>
+              <w:pBdr>
+                <w:top w:space="0" w:sz="0" w:val="nil"/>
+                <w:left w:space="0" w:sz="0" w:val="nil"/>
+                <w:bottom w:space="0" w:sz="0" w:val="nil"/>
+                <w:right w:space="0" w:sz="0" w:val="nil"/>
+                <w:between w:space="0" w:sz="0" w:val="nil"/>
+              </w:pBdr>
+              <w:shd w:fill="auto" w:val="clear"/>
+              <w:spacing w:after="0" w:before="0" w:line="240" w:lineRule="auto"/>
+              <w:ind w:left="0" w:right="0" w:firstLine="0"/>
+              <w:jc w:val="left"/>
+              <w:rPr>
+                <w:rFonts w:ascii="Times New Roman" w:cs="Times New Roman" w:eastAsia="Times New Roman" w:hAnsi="Times New Roman"/>
+                <w:b w:val="1"/>
+                <w:bCs w:val="1"/>
+              </w:rPr>
+            </w:pPr>
+            <w:r>
+              <w:rPr>
+                <w:rFonts w:ascii="Times New Roman" w:cs="Times New Roman" w:eastAsia="Times New Roman" w:hAnsi="Times New Roman"/>
+                <w:b w:val="1"/>
+                <w:bCs w:val="1"/>
+                <w:rtl w:val="0"/>
+              </w:rPr>
+              <w:t xml:space="preserve">Root Cause </w:t>
+            </w:r>
+          </w:p>
+        </w:tc>
+        <w:tc>
+          <w:tcPr>
+            <w:shd w:fill="auto" w:val="clear"/>
+            <w:tcMar>
+              <w:top w:w="100.0" w:type="dxa"/>
+              <w:left w:w="100.0" w:type="dxa"/>
+              <w:bottom w:w="100.0" w:type="dxa"/>
+              <w:right w:w="100.0" w:type="dxa"/>
+            </w:tcMar>
+            <w:vAlign w:val="top"/>
+          </w:tcPr>
+          <w:p>
+            <w:pPr>
+              <w:keepNext w:val="0"/>
+              <w:keepLines w:val="0"/>
+              <w:pageBreakBefore w:val="0"/>
+              <w:widowControl w:val="0"/>
+              <w:pBdr>
+                <w:top w:space="0" w:sz="0" w:val="nil"/>
+                <w:left w:space="0" w:sz="0" w:val="nil"/>
+                <w:bottom w:space="0" w:sz="0" w:val="nil"/>
+                <w:right w:space="0" w:sz="0" w:val="nil"/>
+                <w:between w:space="0" w:sz="0" w:val="nil"/>
+              </w:pBdr>
+              <w:shd w:fill="auto" w:val="clear"/>
+              <w:spacing w:after="0" w:before="0" w:line="240" w:lineRule="auto"/>
+              <w:ind w:left="0" w:right="0" w:firstLine="0"/>
+              <w:jc w:val="left"/>
+              <w:rPr>
+                <w:rFonts w:ascii="Times New Roman" w:cs="Times New Roman" w:eastAsia="Times New Roman" w:hAnsi="Times New Roman"/>
+                <w:b w:val="1"/>
+                <w:bCs w:val="1"/>
+              </w:rPr>
+            </w:pPr>
+            <w:r>
+              <w:rPr>
+                <w:rFonts w:ascii="Times New Roman" w:cs="Times New Roman" w:eastAsia="Times New Roman" w:hAnsi="Times New Roman"/>
+                <w:b w:val="1"/>
+                <w:bCs w:val="1"/>
+                <w:rtl w:val="0"/>
+              </w:rPr>
+              <w:t xml:space="preserve">Where to Fix? </w:t>
+            </w:r>
+          </w:p>
+        </w:tc>
+        <w:tc>
+          <w:tcPr>
+            <w:shd w:fill="auto" w:val="clear"/>
+            <w:tcMar>
+              <w:top w:w="100.0" w:type="dxa"/>
+              <w:left w:w="100.0" w:type="dxa"/>
+              <w:bottom w:w="100.0" w:type="dxa"/>
+              <w:right w:w="100.0" w:type="dxa"/>
+            </w:tcMar>
+            <w:vAlign w:val="top"/>
+          </w:tcPr>
+          <w:p>
+            <w:pPr>
+              <w:keepNext w:val="0"/>
+              <w:keepLines w:val="0"/>
+              <w:pageBreakBefore w:val="0"/>
+              <w:widowControl w:val="0"/>
+              <w:pBdr>
+                <w:top w:space="0" w:sz="0" w:val="nil"/>
+                <w:left w:space="0" w:sz="0" w:val="nil"/>
+                <w:bottom w:space="0" w:sz="0" w:val="nil"/>
+                <w:right w:space="0" w:sz="0" w:val="nil"/>
+                <w:between w:space="0" w:sz="0" w:val="nil"/>
+              </w:pBdr>
+              <w:shd w:fill="auto" w:val="clear"/>
+              <w:spacing w:after="0" w:before="0" w:line="240" w:lineRule="auto"/>
+              <w:ind w:left="0" w:right="0" w:firstLine="0"/>
+              <w:jc w:val="left"/>
+              <w:rPr>
+                <w:rFonts w:ascii="Times New Roman" w:cs="Times New Roman" w:eastAsia="Times New Roman" w:hAnsi="Times New Roman"/>
+                <w:b w:val="1"/>
+                <w:bCs w:val="1"/>
+              </w:rPr>
+            </w:pPr>
+            <w:r>
+              <w:rPr>
+                <w:rFonts w:ascii="Times New Roman" w:cs="Times New Roman" w:eastAsia="Times New Roman" w:hAnsi="Times New Roman"/>
+                <w:b w:val="1"/>
+                <w:bCs w:val="1"/>
+                <w:rtl w:val="0"/>
+              </w:rPr>
+              <w:t xml:space="preserve">Proposed Solution </w:t>
+            </w:r>
+          </w:p>
+        </w:tc>
+        <w:tc>
+          <w:tcPr>
+            <w:shd w:fill="auto" w:val="clear"/>
+            <w:tcMar>
+              <w:top w:w="100.0" w:type="dxa"/>
+              <w:left w:w="100.0" w:type="dxa"/>
+              <w:bottom w:w="100.0" w:type="dxa"/>
+              <w:right w:w="100.0" w:type="dxa"/>
+            </w:tcMar>
+            <w:vAlign w:val="top"/>
+          </w:tcPr>
+          <w:p>
+            <w:pPr>
+              <w:keepNext w:val="0"/>
+              <w:keepLines w:val="0"/>
+              <w:pageBreakBefore w:val="0"/>
+              <w:widowControl w:val="0"/>
+              <w:pBdr>
+                <w:top w:space="0" w:sz="0" w:val="nil"/>
+                <w:left w:space="0" w:sz="0" w:val="nil"/>
+                <w:bottom w:space="0" w:sz="0" w:val="nil"/>
+                <w:right w:space="0" w:sz="0" w:val="nil"/>
+                <w:between w:space="0" w:sz="0" w:val="nil"/>
+              </w:pBdr>
+              <w:shd w:fill="auto" w:val="clear"/>
+              <w:spacing w:after="0" w:before="0" w:line="240" w:lineRule="auto"/>
+              <w:ind w:left="0" w:right="0" w:firstLine="0"/>
+              <w:jc w:val="left"/>
+              <w:rPr>
+                <w:rFonts w:ascii="Times New Roman" w:cs="Times New Roman" w:eastAsia="Times New Roman" w:hAnsi="Times New Roman"/>
+                <w:b w:val="1"/>
+                <w:bCs w:val="1"/>
+              </w:rPr>
+            </w:pPr>
+            <w:r>
+              <w:rPr>
+                <w:rFonts w:ascii="Times New Roman" w:cs="Times New Roman" w:eastAsia="Times New Roman" w:hAnsi="Times New Roman"/>
+                <w:b w:val="1"/>
+                <w:bCs w:val="1"/>
+                <w:rtl w:val="0"/>
+              </w:rPr>
+              <w:t xml:space="preserve">How to Retest? </w:t>
+            </w:r>
+          </w:p>
+        </w:tc>
+      </w:tr>
+      <w:tr>
+        <w:trPr>
+          <w:cantSplit w:val="0"/>
+          <w:tblHeader w:val="0"/>
+        </w:trPr>
+        <w:tc>
+          <w:tcPr>
+            <w:shd w:fill="auto" w:val="clear"/>
+            <w:tcMar>
+              <w:top w:w="100.0" w:type="dxa"/>
+              <w:left w:w="100.0" w:type="dxa"/>
+              <w:bottom w:w="100.0" w:type="dxa"/>
+              <w:right w:w="100.0" w:type="dxa"/>
+            </w:tcMar>
+            <w:vAlign w:val="top"/>
+          </w:tcPr>
+          <w:p>
+            <w:pPr>
+              <w:keepNext w:val="0"/>
+              <w:keepLines w:val="0"/>
+              <w:pageBreakBefore w:val="0"/>
+              <w:widowControl w:val="0"/>
+              <w:pBdr>
+                <w:top w:space="0" w:sz="0" w:val="nil"/>
+                <w:left w:space="0" w:sz="0" w:val="nil"/>
+                <w:bottom w:space="0" w:sz="0" w:val="nil"/>
+                <w:right w:space="0" w:sz="0" w:val="nil"/>
+                <w:between w:space="0" w:sz="0" w:val="nil"/>
+              </w:pBdr>
+              <w:shd w:fill="auto" w:val="clear"/>
+              <w:spacing w:after="0" w:before="0" w:line="240" w:lineRule="auto"/>
+              <w:ind w:left="0" w:right="0" w:firstLine="0"/>
+              <w:jc w:val="left"/>
+              <w:rPr>
+                <w:rFonts w:ascii="Times New Roman" w:cs="Times New Roman" w:eastAsia="Times New Roman" w:hAnsi="Times New Roman"/>
+              </w:rPr>
+            </w:pPr>
+            <w:r>
+              <w:rPr>
+                <w:rFonts w:ascii="Times New Roman" w:cs="Times New Roman" w:eastAsia="Times New Roman" w:hAnsi="Times New Roman"/>
+                <w:rtl w:val="0"/>
+              </w:rPr>
+              <w:t xml:space="preserve">Invalid BMI data accepted </w:t>
+            </w:r>
+          </w:p>
+        </w:tc>
+        <w:tc>
+          <w:tcPr>
+            <w:shd w:fill="auto" w:val="clear"/>
+            <w:tcMar>
+              <w:top w:w="100.0" w:type="dxa"/>
+              <w:left w:w="100.0" w:type="dxa"/>
+              <w:bottom w:w="100.0" w:type="dxa"/>
+              <w:right w:w="100.0" w:type="dxa"/>
+            </w:tcMar>
+            <w:vAlign w:val="top"/>
+          </w:tcPr>
+          <w:p>
+            <w:pPr>
+              <w:keepNext w:val="0"/>
+              <w:keepLines w:val="0"/>
+              <w:pageBreakBefore w:val="0"/>
+              <w:widowControl w:val="0"/>
+              <w:pBdr>
+                <w:top w:space="0" w:sz="0" w:val="nil"/>
+                <w:left w:space="0" w:sz="0" w:val="nil"/>
+                <w:bottom w:space="0" w:sz="0" w:val="nil"/>
+                <w:right w:space="0" w:sz="0" w:val="nil"/>
+                <w:between w:space="0" w:sz="0" w:val="nil"/>
+              </w:pBdr>
+              <w:shd w:fill="auto" w:val="clear"/>
+              <w:spacing w:after="0" w:before="0" w:line="240" w:lineRule="auto"/>
+              <w:ind w:left="0" w:right="0" w:firstLine="0"/>
+              <w:jc w:val="left"/>
+              <w:rPr>
+                <w:rFonts w:ascii="Times New Roman" w:cs="Times New Roman" w:eastAsia="Times New Roman" w:hAnsi="Times New Roman"/>
+              </w:rPr>
+            </w:pPr>
+            <w:r>
+              <w:rPr>
+                <w:rFonts w:ascii="Times New Roman" w:cs="Times New Roman" w:eastAsia="Times New Roman" w:hAnsi="Times New Roman"/>
+                <w:rtl w:val="0"/>
+              </w:rPr>
+              <w:t xml:space="preserve">Backend does not validate the input properly </w:t>
+            </w:r>
+          </w:p>
+        </w:tc>
+        <w:tc>
+          <w:tcPr>
+            <w:shd w:fill="auto" w:val="clear"/>
+            <w:tcMar>
+              <w:top w:w="100.0" w:type="dxa"/>
+              <w:left w:w="100.0" w:type="dxa"/>
+              <w:bottom w:w="100.0" w:type="dxa"/>
+              <w:right w:w="100.0" w:type="dxa"/>
+            </w:tcMar>
+            <w:vAlign w:val="top"/>
+          </w:tcPr>
+          <w:p>
+            <w:pPr>
+              <w:keepNext w:val="0"/>
+              <w:keepLines w:val="0"/>
+              <w:pageBreakBefore w:val="0"/>
+              <w:widowControl w:val="0"/>
+              <w:pBdr>
+                <w:top w:space="0" w:sz="0" w:val="nil"/>
+                <w:left w:space="0" w:sz="0" w:val="nil"/>
+                <w:bottom w:space="0" w:sz="0" w:val="nil"/>
+                <w:right w:space="0" w:sz="0" w:val="nil"/>
+                <w:between w:space="0" w:sz="0" w:val="nil"/>
+              </w:pBdr>
+              <w:shd w:fill="auto" w:val="clear"/>
+              <w:spacing w:after="0" w:before="0" w:line="240" w:lineRule="auto"/>
+              <w:ind w:left="0" w:right="0" w:firstLine="0"/>
+              <w:jc w:val="left"/>
+              <w:rPr>
+                <w:rFonts w:ascii="Times New Roman" w:cs="Times New Roman" w:eastAsia="Times New Roman" w:hAnsi="Times New Roman"/>
+              </w:rPr>
+            </w:pPr>
+            <w:r>
+              <w:rPr>
+                <w:rFonts w:ascii="Times New Roman" w:cs="Times New Roman" w:eastAsia="Times New Roman" w:hAnsi="Times New Roman"/>
+                <w:rtl w:val="0"/>
+              </w:rPr>
+              <w:t xml:space="preserve">Backend </w:t>
+            </w:r>
+          </w:p>
+        </w:tc>
+        <w:tc>
+          <w:tcPr>
+            <w:shd w:fill="auto" w:val="clear"/>
+            <w:tcMar>
+              <w:top w:w="100.0" w:type="dxa"/>
+              <w:left w:w="100.0" w:type="dxa"/>
+              <w:bottom w:w="100.0" w:type="dxa"/>
+              <w:right w:w="100.0" w:type="dxa"/>
+            </w:tcMar>
+            <w:vAlign w:val="top"/>
+          </w:tcPr>
+          <w:p>
+            <w:pPr>
+              <w:keepNext w:val="0"/>
+              <w:keepLines w:val="0"/>
+              <w:pageBreakBefore w:val="0"/>
+              <w:widowControl w:val="0"/>
+              <w:pBdr>
+                <w:top w:space="0" w:sz="0" w:val="nil"/>
+                <w:left w:space="0" w:sz="0" w:val="nil"/>
+                <w:bottom w:space="0" w:sz="0" w:val="nil"/>
+                <w:right w:space="0" w:sz="0" w:val="nil"/>
+                <w:between w:space="0" w:sz="0" w:val="nil"/>
+              </w:pBdr>
+              <w:shd w:fill="auto" w:val="clear"/>
+              <w:spacing w:after="0" w:before="0" w:line="240" w:lineRule="auto"/>
+              <w:ind w:left="0" w:right="0" w:firstLine="0"/>
+              <w:jc w:val="left"/>
+              <w:rPr>
+                <w:rFonts w:ascii="Times New Roman" w:cs="Times New Roman" w:eastAsia="Times New Roman" w:hAnsi="Times New Roman"/>
+              </w:rPr>
+            </w:pPr>
+            <w:r>
+              <w:rPr>
+                <w:rFonts w:ascii="Times New Roman" w:cs="Times New Roman" w:eastAsia="Times New Roman" w:hAnsi="Times New Roman"/>
+                <w:rtl w:val="0"/>
+              </w:rPr>
+              <w:t xml:space="preserve">Validate name, age, height, and weight before saving data </w:t>
+            </w:r>
+          </w:p>
+        </w:tc>
+        <w:tc>
+          <w:tcPr>
+            <w:shd w:fill="auto" w:val="clear"/>
+            <w:tcMar>
+              <w:top w:w="100.0" w:type="dxa"/>
+              <w:left w:w="100.0" w:type="dxa"/>
+              <w:bottom w:w="100.0" w:type="dxa"/>
+              <w:right w:w="100.0" w:type="dxa"/>
+            </w:tcMar>
+            <w:vAlign w:val="top"/>
+          </w:tcPr>
+          <w:p>
+            <w:pPr>
+              <w:keepNext w:val="0"/>
+              <w:keepLines w:val="0"/>
+              <w:pageBreakBefore w:val="0"/>
+              <w:widowControl w:val="0"/>
+              <w:pBdr>
+                <w:top w:space="0" w:sz="0" w:val="nil"/>
+                <w:left w:space="0" w:sz="0" w:val="nil"/>
+                <w:bottom w:space="0" w:sz="0" w:val="nil"/>
+                <w:right w:space="0" w:sz="0" w:val="nil"/>
+                <w:between w:space="0" w:sz="0" w:val="nil"/>
+              </w:pBdr>
+              <w:shd w:fill="auto" w:val="clear"/>
+              <w:spacing w:after="0" w:before="0" w:line="240" w:lineRule="auto"/>
+              <w:ind w:left="0" w:right="0" w:firstLine="0"/>
+              <w:jc w:val="left"/>
+              <w:rPr>
+                <w:rFonts w:ascii="Times New Roman" w:cs="Times New Roman" w:eastAsia="Times New Roman" w:hAnsi="Times New Roman"/>
+              </w:rPr>
+            </w:pPr>
+            <w:r>
+              <w:rPr>
+                <w:rFonts w:ascii="Times New Roman" w:cs="Times New Roman" w:eastAsia="Times New Roman" w:hAnsi="Times New Roman"/>
+                <w:rtl w:val="0"/>
+              </w:rPr>
+              <w:t xml:space="preserve">Submit invalid BMI data again using Postman/Thunder Client </w:t>
+            </w:r>
+          </w:p>
+        </w:tc>
+      </w:tr>
+      <w:tr>
+        <w:trPr>
+          <w:cantSplit w:val="0"/>
+          <w:tblHeader w:val="0"/>
+        </w:trPr>
+        <w:tc>
+          <w:tcPr>
+            <w:shd w:fill="auto" w:val="clear"/>
+            <w:tcMar>
+              <w:top w:w="100.0" w:type="dxa"/>
+              <w:left w:w="100.0" w:type="dxa"/>
+              <w:bottom w:w="100.0" w:type="dxa"/>
+              <w:right w:w="100.0" w:type="dxa"/>
+            </w:tcMar>
+            <w:vAlign w:val="top"/>
+          </w:tcPr>
+          <w:p>
+            <w:pPr>
+              <w:keepNext w:val="0"/>
+              <w:keepLines w:val="0"/>
+              <w:pageBreakBefore w:val="0"/>
+              <w:widowControl w:val="0"/>
+              <w:pBdr>
+                <w:top w:space="0" w:sz="0" w:val="nil"/>
+                <w:left w:space="0" w:sz="0" w:val="nil"/>
+                <w:bottom w:space="0" w:sz="0" w:val="nil"/>
+                <w:right w:space="0" w:sz="0" w:val="nil"/>
+                <w:between w:space="0" w:sz="0" w:val="nil"/>
+              </w:pBdr>
+              <w:shd w:fill="auto" w:val="clear"/>
+              <w:spacing w:after="0" w:before="0" w:line="240" w:lineRule="auto"/>
+              <w:ind w:left="0" w:right="0" w:firstLine="0"/>
+              <w:jc w:val="left"/>
+              <w:rPr>
+                <w:rFonts w:ascii="Times New Roman" w:cs="Times New Roman" w:eastAsia="Times New Roman" w:hAnsi="Times New Roman"/>
+              </w:rPr>
+            </w:pPr>
+            <w:r>
+              <w:rPr>
+                <w:rFonts w:ascii="Times New Roman" w:cs="Times New Roman" w:eastAsia="Times New Roman" w:hAnsi="Times New Roman"/>
+                <w:rtl w:val="0"/>
+              </w:rPr>
+              <w:t xml:space="preserve">User can access another user’s BMI record </w:t>
+            </w:r>
+          </w:p>
+        </w:tc>
+        <w:tc>
+          <w:tcPr>
+            <w:shd w:fill="auto" w:val="clear"/>
+            <w:tcMar>
+              <w:top w:w="100.0" w:type="dxa"/>
+              <w:left w:w="100.0" w:type="dxa"/>
+              <w:bottom w:w="100.0" w:type="dxa"/>
+              <w:right w:w="100.0" w:type="dxa"/>
+            </w:tcMar>
+            <w:vAlign w:val="top"/>
+          </w:tcPr>
+          <w:p>
+            <w:pPr>
+              <w:keepNext w:val="0"/>
+              <w:keepLines w:val="0"/>
+              <w:pageBreakBefore w:val="0"/>
+              <w:widowControl w:val="0"/>
+              <w:pBdr>
+                <w:top w:space="0" w:sz="0" w:val="nil"/>
+                <w:left w:space="0" w:sz="0" w:val="nil"/>
+                <w:bottom w:space="0" w:sz="0" w:val="nil"/>
+                <w:right w:space="0" w:sz="0" w:val="nil"/>
+                <w:between w:space="0" w:sz="0" w:val="nil"/>
+              </w:pBdr>
+              <w:shd w:fill="auto" w:val="clear"/>
+              <w:spacing w:after="0" w:before="0" w:line="240" w:lineRule="auto"/>
+              <w:ind w:left="0" w:right="0" w:firstLine="0"/>
+              <w:jc w:val="left"/>
+              <w:rPr>
+                <w:rFonts w:ascii="Times New Roman" w:cs="Times New Roman" w:eastAsia="Times New Roman" w:hAnsi="Times New Roman"/>
+              </w:rPr>
+            </w:pPr>
+            <w:r>
+              <w:rPr>
+                <w:rFonts w:ascii="Times New Roman" w:cs="Times New Roman" w:eastAsia="Times New Roman" w:hAnsi="Times New Roman"/>
+                <w:rtl w:val="0"/>
+              </w:rPr>
+              <w:t xml:space="preserve">No ownership check is applied </w:t>
+            </w:r>
+          </w:p>
+        </w:tc>
+        <w:tc>
+          <w:tcPr>
+            <w:shd w:fill="auto" w:val="clear"/>
+            <w:tcMar>
+              <w:top w:w="100.0" w:type="dxa"/>
+              <w:left w:w="100.0" w:type="dxa"/>
+              <w:bottom w:w="100.0" w:type="dxa"/>
+              <w:right w:w="100.0" w:type="dxa"/>
+            </w:tcMar>
+            <w:vAlign w:val="top"/>
+          </w:tcPr>
+          <w:p>
+            <w:pPr>
+              <w:keepNext w:val="0"/>
+              <w:keepLines w:val="0"/>
+              <w:pageBreakBefore w:val="0"/>
+              <w:widowControl w:val="0"/>
+              <w:pBdr>
+                <w:top w:space="0" w:sz="0" w:val="nil"/>
+                <w:left w:space="0" w:sz="0" w:val="nil"/>
+                <w:bottom w:space="0" w:sz="0" w:val="nil"/>
+                <w:right w:space="0" w:sz="0" w:val="nil"/>
+                <w:between w:space="0" w:sz="0" w:val="nil"/>
+              </w:pBdr>
+              <w:shd w:fill="auto" w:val="clear"/>
+              <w:spacing w:after="0" w:before="0" w:line="240" w:lineRule="auto"/>
+              <w:ind w:left="0" w:right="0" w:firstLine="0"/>
+              <w:jc w:val="left"/>
+              <w:rPr>
+                <w:rFonts w:ascii="Times New Roman" w:cs="Times New Roman" w:eastAsia="Times New Roman" w:hAnsi="Times New Roman"/>
+              </w:rPr>
+            </w:pPr>
+            <w:r>
+              <w:rPr>
+                <w:rFonts w:ascii="Times New Roman" w:cs="Times New Roman" w:eastAsia="Times New Roman" w:hAnsi="Times New Roman"/>
+                <w:rtl w:val="0"/>
+              </w:rPr>
+              <w:t xml:space="preserve">Backend API </w:t>
+            </w:r>
+          </w:p>
+        </w:tc>
+        <w:tc>
+          <w:tcPr>
+            <w:shd w:fill="auto" w:val="clear"/>
+            <w:tcMar>
+              <w:top w:w="100.0" w:type="dxa"/>
+              <w:left w:w="100.0" w:type="dxa"/>
+              <w:bottom w:w="100.0" w:type="dxa"/>
+              <w:right w:w="100.0" w:type="dxa"/>
+            </w:tcMar>
+            <w:vAlign w:val="top"/>
+          </w:tcPr>
+          <w:p>
+            <w:pPr>
+              <w:keepNext w:val="0"/>
+              <w:keepLines w:val="0"/>
+              <w:pageBreakBefore w:val="0"/>
+              <w:widowControl w:val="0"/>
+              <w:pBdr>
+                <w:top w:space="0" w:sz="0" w:val="nil"/>
+                <w:left w:space="0" w:sz="0" w:val="nil"/>
+                <w:bottom w:space="0" w:sz="0" w:val="nil"/>
+                <w:right w:space="0" w:sz="0" w:val="nil"/>
+                <w:between w:space="0" w:sz="0" w:val="nil"/>
+              </w:pBdr>
+              <w:shd w:fill="auto" w:val="clear"/>
+              <w:spacing w:after="0" w:before="0" w:line="240" w:lineRule="auto"/>
+              <w:ind w:left="0" w:right="0" w:firstLine="0"/>
+              <w:jc w:val="left"/>
+              <w:rPr>
+                <w:rFonts w:ascii="Times New Roman" w:cs="Times New Roman" w:eastAsia="Times New Roman" w:hAnsi="Times New Roman"/>
+              </w:rPr>
+            </w:pPr>
+            <w:r>
+              <w:rPr>
+                <w:rFonts w:ascii="Times New Roman" w:cs="Times New Roman" w:eastAsia="Times New Roman" w:hAnsi="Times New Roman"/>
+                <w:rtl w:val="0"/>
+              </w:rPr>
+              <w:t xml:space="preserve">Compare the logged-in user ID from JWT with the record owner ID </w:t>
+            </w:r>
+          </w:p>
+        </w:tc>
+        <w:tc>
+          <w:tcPr>
+            <w:shd w:fill="auto" w:val="clear"/>
+            <w:tcMar>
+              <w:top w:w="100.0" w:type="dxa"/>
+              <w:left w:w="100.0" w:type="dxa"/>
+              <w:bottom w:w="100.0" w:type="dxa"/>
+              <w:right w:w="100.0" w:type="dxa"/>
+            </w:tcMar>
+            <w:vAlign w:val="top"/>
+          </w:tcPr>
+          <w:p>
+            <w:pPr>
+              <w:keepNext w:val="0"/>
+              <w:keepLines w:val="0"/>
+              <w:pageBreakBefore w:val="0"/>
+              <w:widowControl w:val="0"/>
+              <w:pBdr>
+                <w:top w:space="0" w:sz="0" w:val="nil"/>
+                <w:left w:space="0" w:sz="0" w:val="nil"/>
+                <w:bottom w:space="0" w:sz="0" w:val="nil"/>
+                <w:right w:space="0" w:sz="0" w:val="nil"/>
+                <w:between w:space="0" w:sz="0" w:val="nil"/>
+              </w:pBdr>
+              <w:shd w:fill="auto" w:val="clear"/>
+              <w:spacing w:after="0" w:before="0" w:line="240" w:lineRule="auto"/>
+              <w:ind w:left="0" w:right="0" w:firstLine="0"/>
+              <w:jc w:val="left"/>
+              <w:rPr>
+                <w:rFonts w:ascii="Times New Roman" w:cs="Times New Roman" w:eastAsia="Times New Roman" w:hAnsi="Times New Roman"/>
+              </w:rPr>
+            </w:pPr>
+            <w:r>
+              <w:rPr>
+                <w:rFonts w:ascii="Times New Roman" w:cs="Times New Roman" w:eastAsia="Times New Roman" w:hAnsi="Times New Roman"/>
+                <w:rtl w:val="0"/>
+              </w:rPr>
+              <w:t xml:space="preserve">Try to access another user’s BMI record again </w:t>
+            </w:r>
+          </w:p>
+        </w:tc>
+      </w:tr>
+      <w:tr>
+        <w:trPr>
+          <w:cantSplit w:val="0"/>
+          <w:tblHeader w:val="0"/>
+        </w:trPr>
+        <w:tc>
+          <w:tcPr>
+            <w:shd w:fill="auto" w:val="clear"/>
+            <w:tcMar>
+              <w:top w:w="100.0" w:type="dxa"/>
+              <w:left w:w="100.0" w:type="dxa"/>
+              <w:bottom w:w="100.0" w:type="dxa"/>
+              <w:right w:w="100.0" w:type="dxa"/>
+            </w:tcMar>
+            <w:vAlign w:val="top"/>
+          </w:tcPr>
+          <w:p>
+            <w:pPr>
+              <w:keepNext w:val="0"/>
+              <w:keepLines w:val="0"/>
+              <w:pageBreakBefore w:val="0"/>
+              <w:widowControl w:val="0"/>
+              <w:pBdr>
+                <w:top w:space="0" w:sz="0" w:val="nil"/>
+                <w:left w:space="0" w:sz="0" w:val="nil"/>
+                <w:bottom w:space="0" w:sz="0" w:val="nil"/>
+                <w:right w:space="0" w:sz="0" w:val="nil"/>
+                <w:between w:space="0" w:sz="0" w:val="nil"/>
+              </w:pBdr>
+              <w:shd w:fill="auto" w:val="clear"/>
+              <w:spacing w:after="0" w:before="0" w:line="240" w:lineRule="auto"/>
+              <w:ind w:left="0" w:right="0" w:firstLine="0"/>
+              <w:jc w:val="left"/>
+              <w:rPr>
+                <w:rFonts w:ascii="Times New Roman" w:cs="Times New Roman" w:eastAsia="Times New Roman" w:hAnsi="Times New Roman"/>
+              </w:rPr>
+            </w:pPr>
+            <w:r>
+              <w:rPr>
+                <w:rFonts w:ascii="Times New Roman" w:cs="Times New Roman" w:eastAsia="Times New Roman" w:hAnsi="Times New Roman"/>
+                <w:rtl w:val="0"/>
+              </w:rPr>
+              <w:t xml:space="preserve">Normal user can access staff route </w:t>
+            </w:r>
+          </w:p>
+        </w:tc>
+        <w:tc>
+          <w:tcPr>
+            <w:shd w:fill="auto" w:val="clear"/>
+            <w:tcMar>
+              <w:top w:w="100.0" w:type="dxa"/>
+              <w:left w:w="100.0" w:type="dxa"/>
+              <w:bottom w:w="100.0" w:type="dxa"/>
+              <w:right w:w="100.0" w:type="dxa"/>
+            </w:tcMar>
+            <w:vAlign w:val="top"/>
+          </w:tcPr>
+          <w:p>
+            <w:pPr>
+              <w:keepNext w:val="0"/>
+              <w:keepLines w:val="0"/>
+              <w:pageBreakBefore w:val="0"/>
+              <w:widowControl w:val="0"/>
+              <w:pBdr>
+                <w:top w:space="0" w:sz="0" w:val="nil"/>
+                <w:left w:space="0" w:sz="0" w:val="nil"/>
+                <w:bottom w:space="0" w:sz="0" w:val="nil"/>
+                <w:right w:space="0" w:sz="0" w:val="nil"/>
+                <w:between w:space="0" w:sz="0" w:val="nil"/>
+              </w:pBdr>
+              <w:shd w:fill="auto" w:val="clear"/>
+              <w:spacing w:after="0" w:before="0" w:line="240" w:lineRule="auto"/>
+              <w:ind w:left="0" w:right="0" w:firstLine="0"/>
+              <w:jc w:val="left"/>
+              <w:rPr>
+                <w:rFonts w:ascii="Times New Roman" w:cs="Times New Roman" w:eastAsia="Times New Roman" w:hAnsi="Times New Roman"/>
+              </w:rPr>
+            </w:pPr>
+            <w:r>
+              <w:rPr>
+                <w:rFonts w:ascii="Times New Roman" w:cs="Times New Roman" w:eastAsia="Times New Roman" w:hAnsi="Times New Roman"/>
+                <w:rtl w:val="0"/>
+              </w:rPr>
+              <w:t xml:space="preserve">No role checking for staff route </w:t>
+            </w:r>
+          </w:p>
+        </w:tc>
+        <w:tc>
+          <w:tcPr>
+            <w:shd w:fill="auto" w:val="clear"/>
+            <w:tcMar>
+              <w:top w:w="100.0" w:type="dxa"/>
+              <w:left w:w="100.0" w:type="dxa"/>
+              <w:bottom w:w="100.0" w:type="dxa"/>
+              <w:right w:w="100.0" w:type="dxa"/>
+            </w:tcMar>
+            <w:vAlign w:val="top"/>
+          </w:tcPr>
+          <w:p>
+            <w:pPr>
+              <w:keepNext w:val="0"/>
+              <w:keepLines w:val="0"/>
+              <w:pageBreakBefore w:val="0"/>
+              <w:widowControl w:val="0"/>
+              <w:pBdr>
+                <w:top w:space="0" w:sz="0" w:val="nil"/>
+                <w:left w:space="0" w:sz="0" w:val="nil"/>
+                <w:bottom w:space="0" w:sz="0" w:val="nil"/>
+                <w:right w:space="0" w:sz="0" w:val="nil"/>
+                <w:between w:space="0" w:sz="0" w:val="nil"/>
+              </w:pBdr>
+              <w:shd w:fill="auto" w:val="clear"/>
+              <w:spacing w:after="0" w:before="0" w:line="240" w:lineRule="auto"/>
+              <w:ind w:left="0" w:right="0" w:firstLine="0"/>
+              <w:jc w:val="left"/>
+              <w:rPr>
+                <w:rFonts w:ascii="Times New Roman" w:cs="Times New Roman" w:eastAsia="Times New Roman" w:hAnsi="Times New Roman"/>
+              </w:rPr>
+            </w:pPr>
+            <w:r>
+              <w:rPr>
+                <w:rFonts w:ascii="Times New Roman" w:cs="Times New Roman" w:eastAsia="Times New Roman" w:hAnsi="Times New Roman"/>
+                <w:rtl w:val="0"/>
+              </w:rPr>
+              <w:t xml:space="preserve">Backend API </w:t>
+            </w:r>
+          </w:p>
+        </w:tc>
+        <w:tc>
+          <w:tcPr>
+            <w:shd w:fill="auto" w:val="clear"/>
+            <w:tcMar>
+              <w:top w:w="100.0" w:type="dxa"/>
+              <w:left w:w="100.0" w:type="dxa"/>
+              <w:bottom w:w="100.0" w:type="dxa"/>
+              <w:right w:w="100.0" w:type="dxa"/>
+            </w:tcMar>
+            <w:vAlign w:val="top"/>
+          </w:tcPr>
+          <w:p>
+            <w:pPr>
+              <w:keepNext w:val="0"/>
+              <w:keepLines w:val="0"/>
+              <w:pageBreakBefore w:val="0"/>
+              <w:widowControl w:val="0"/>
+              <w:pBdr>
+                <w:top w:space="0" w:sz="0" w:val="nil"/>
+                <w:left w:space="0" w:sz="0" w:val="nil"/>
+                <w:bottom w:space="0" w:sz="0" w:val="nil"/>
+                <w:right w:space="0" w:sz="0" w:val="nil"/>
+                <w:between w:space="0" w:sz="0" w:val="nil"/>
+              </w:pBdr>
+              <w:shd w:fill="auto" w:val="clear"/>
+              <w:spacing w:after="0" w:before="0" w:line="240" w:lineRule="auto"/>
+              <w:ind w:left="0" w:right="0" w:firstLine="0"/>
+              <w:jc w:val="left"/>
+              <w:rPr>
+                <w:rFonts w:ascii="Times New Roman" w:cs="Times New Roman" w:eastAsia="Times New Roman" w:hAnsi="Times New Roman"/>
+              </w:rPr>
+            </w:pPr>
+            <w:r>
+              <w:rPr>
+                <w:rFonts w:ascii="Times New Roman" w:cs="Times New Roman" w:eastAsia="Times New Roman" w:hAnsi="Times New Roman"/>
+                <w:rtl w:val="0"/>
+              </w:rPr>
+              <w:t xml:space="preserve">Allow only staff and admin roles to access staff routes </w:t>
+            </w:r>
+          </w:p>
+        </w:tc>
+        <w:tc>
+          <w:tcPr>
+            <w:shd w:fill="auto" w:val="clear"/>
+            <w:tcMar>
+              <w:top w:w="100.0" w:type="dxa"/>
+              <w:left w:w="100.0" w:type="dxa"/>
+              <w:bottom w:w="100.0" w:type="dxa"/>
+              <w:right w:w="100.0" w:type="dxa"/>
+            </w:tcMar>
+            <w:vAlign w:val="top"/>
+          </w:tcPr>
+          <w:p>
+            <w:pPr>
+              <w:keepNext w:val="0"/>
+              <w:keepLines w:val="0"/>
+              <w:pageBreakBefore w:val="0"/>
+              <w:widowControl w:val="0"/>
+              <w:pBdr>
+                <w:top w:space="0" w:sz="0" w:val="nil"/>
+                <w:left w:space="0" w:sz="0" w:val="nil"/>
+                <w:bottom w:space="0" w:sz="0" w:val="nil"/>
+                <w:right w:space="0" w:sz="0" w:val="nil"/>
+                <w:between w:space="0" w:sz="0" w:val="nil"/>
+              </w:pBdr>
+              <w:shd w:fill="auto" w:val="clear"/>
+              <w:spacing w:after="0" w:before="0" w:line="240" w:lineRule="auto"/>
+              <w:ind w:left="0" w:right="0" w:firstLine="0"/>
+              <w:jc w:val="left"/>
+              <w:rPr>
+                <w:rFonts w:ascii="Times New Roman" w:cs="Times New Roman" w:eastAsia="Times New Roman" w:hAnsi="Times New Roman"/>
+              </w:rPr>
+            </w:pPr>
+            <w:r>
+              <w:rPr>
+                <w:rFonts w:ascii="Times New Roman" w:cs="Times New Roman" w:eastAsia="Times New Roman" w:hAnsi="Times New Roman"/>
+                <w:rtl w:val="0"/>
+              </w:rPr>
+              <w:t xml:space="preserve">Send request to staff route using normal user token </w:t>
+            </w:r>
+          </w:p>
+        </w:tc>
+      </w:tr>
+      <w:tr>
+        <w:trPr>
+          <w:cantSplit w:val="0"/>
+          <w:tblHeader w:val="0"/>
+        </w:trPr>
+        <w:tc>
+          <w:tcPr>
+            <w:shd w:fill="auto" w:val="clear"/>
+            <w:tcMar>
+              <w:top w:w="100.0" w:type="dxa"/>
+              <w:left w:w="100.0" w:type="dxa"/>
+              <w:bottom w:w="100.0" w:type="dxa"/>
+              <w:right w:w="100.0" w:type="dxa"/>
+            </w:tcMar>
+            <w:vAlign w:val="top"/>
+          </w:tcPr>
+          <w:p>
+            <w:pPr>
+              <w:keepNext w:val="0"/>
+              <w:keepLines w:val="0"/>
+              <w:pageBreakBefore w:val="0"/>
+              <w:widowControl w:val="0"/>
+              <w:pBdr>
+                <w:top w:space="0" w:sz="0" w:val="nil"/>
+                <w:left w:space="0" w:sz="0" w:val="nil"/>
+                <w:bottom w:space="0" w:sz="0" w:val="nil"/>
+                <w:right w:space="0" w:sz="0" w:val="nil"/>
+                <w:between w:space="0" w:sz="0" w:val="nil"/>
+              </w:pBdr>
+              <w:shd w:fill="auto" w:val="clear"/>
+              <w:spacing w:after="0" w:before="0" w:line="240" w:lineRule="auto"/>
+              <w:ind w:left="0" w:right="0" w:firstLine="0"/>
+              <w:jc w:val="left"/>
+              <w:rPr>
+                <w:rFonts w:ascii="Times New Roman" w:cs="Times New Roman" w:eastAsia="Times New Roman" w:hAnsi="Times New Roman"/>
+              </w:rPr>
+            </w:pPr>
+            <w:r>
+              <w:rPr>
+                <w:rFonts w:ascii="Times New Roman" w:cs="Times New Roman" w:eastAsia="Times New Roman" w:hAnsi="Times New Roman"/>
+                <w:rtl w:val="0"/>
+              </w:rPr>
+              <w:t xml:space="preserve">Normal user can access admin route </w:t>
+            </w:r>
+          </w:p>
+        </w:tc>
+        <w:tc>
+          <w:tcPr>
+            <w:shd w:fill="auto" w:val="clear"/>
+            <w:tcMar>
+              <w:top w:w="100.0" w:type="dxa"/>
+              <w:left w:w="100.0" w:type="dxa"/>
+              <w:bottom w:w="100.0" w:type="dxa"/>
+              <w:right w:w="100.0" w:type="dxa"/>
+            </w:tcMar>
+            <w:vAlign w:val="top"/>
+          </w:tcPr>
+          <w:p>
+            <w:pPr>
+              <w:keepNext w:val="0"/>
+              <w:keepLines w:val="0"/>
+              <w:pageBreakBefore w:val="0"/>
+              <w:widowControl w:val="0"/>
+              <w:pBdr>
+                <w:top w:space="0" w:sz="0" w:val="nil"/>
+                <w:left w:space="0" w:sz="0" w:val="nil"/>
+                <w:bottom w:space="0" w:sz="0" w:val="nil"/>
+                <w:right w:space="0" w:sz="0" w:val="nil"/>
+                <w:between w:space="0" w:sz="0" w:val="nil"/>
+              </w:pBdr>
+              <w:shd w:fill="auto" w:val="clear"/>
+              <w:spacing w:after="0" w:before="0" w:line="240" w:lineRule="auto"/>
+              <w:ind w:left="0" w:right="0" w:firstLine="0"/>
+              <w:jc w:val="left"/>
+              <w:rPr>
+                <w:rFonts w:ascii="Times New Roman" w:cs="Times New Roman" w:eastAsia="Times New Roman" w:hAnsi="Times New Roman"/>
+              </w:rPr>
+            </w:pPr>
+            <w:r>
+              <w:rPr>
+                <w:rFonts w:ascii="Times New Roman" w:cs="Times New Roman" w:eastAsia="Times New Roman" w:hAnsi="Times New Roman"/>
+                <w:rtl w:val="0"/>
+              </w:rPr>
+              <w:t xml:space="preserve">No role checking for admin route </w:t>
+            </w:r>
+          </w:p>
+        </w:tc>
+        <w:tc>
+          <w:tcPr>
+            <w:shd w:fill="auto" w:val="clear"/>
+            <w:tcMar>
+              <w:top w:w="100.0" w:type="dxa"/>
+              <w:left w:w="100.0" w:type="dxa"/>
+              <w:bottom w:w="100.0" w:type="dxa"/>
+              <w:right w:w="100.0" w:type="dxa"/>
+            </w:tcMar>
+            <w:vAlign w:val="top"/>
+          </w:tcPr>
+          <w:p>
+            <w:pPr>
+              <w:keepNext w:val="0"/>
+              <w:keepLines w:val="0"/>
+              <w:pageBreakBefore w:val="0"/>
+              <w:widowControl w:val="0"/>
+              <w:pBdr>
+                <w:top w:space="0" w:sz="0" w:val="nil"/>
+                <w:left w:space="0" w:sz="0" w:val="nil"/>
+                <w:bottom w:space="0" w:sz="0" w:val="nil"/>
+                <w:right w:space="0" w:sz="0" w:val="nil"/>
+                <w:between w:space="0" w:sz="0" w:val="nil"/>
+              </w:pBdr>
+              <w:shd w:fill="auto" w:val="clear"/>
+              <w:spacing w:after="0" w:before="0" w:line="240" w:lineRule="auto"/>
+              <w:ind w:left="0" w:right="0" w:firstLine="0"/>
+              <w:jc w:val="left"/>
+              <w:rPr>
+                <w:rFonts w:ascii="Times New Roman" w:cs="Times New Roman" w:eastAsia="Times New Roman" w:hAnsi="Times New Roman"/>
+              </w:rPr>
+            </w:pPr>
+            <w:r>
+              <w:rPr>
+                <w:rFonts w:ascii="Times New Roman" w:cs="Times New Roman" w:eastAsia="Times New Roman" w:hAnsi="Times New Roman"/>
+                <w:rtl w:val="0"/>
+              </w:rPr>
+              <w:t xml:space="preserve">Backend API </w:t>
+            </w:r>
+          </w:p>
+        </w:tc>
+        <w:tc>
+          <w:tcPr>
+            <w:shd w:fill="auto" w:val="clear"/>
+            <w:tcMar>
+              <w:top w:w="100.0" w:type="dxa"/>
+              <w:left w:w="100.0" w:type="dxa"/>
+              <w:bottom w:w="100.0" w:type="dxa"/>
+              <w:right w:w="100.0" w:type="dxa"/>
+            </w:tcMar>
+            <w:vAlign w:val="top"/>
+          </w:tcPr>
+          <w:p>
+            <w:pPr>
+              <w:keepNext w:val="0"/>
+              <w:keepLines w:val="0"/>
+              <w:pageBreakBefore w:val="0"/>
+              <w:widowControl w:val="0"/>
+              <w:pBdr>
+                <w:top w:space="0" w:sz="0" w:val="nil"/>
+                <w:left w:space="0" w:sz="0" w:val="nil"/>
+                <w:bottom w:space="0" w:sz="0" w:val="nil"/>
+                <w:right w:space="0" w:sz="0" w:val="nil"/>
+                <w:between w:space="0" w:sz="0" w:val="nil"/>
+              </w:pBdr>
+              <w:shd w:fill="auto" w:val="clear"/>
+              <w:spacing w:after="0" w:before="0" w:line="240" w:lineRule="auto"/>
+              <w:ind w:left="0" w:right="0" w:firstLine="0"/>
+              <w:jc w:val="left"/>
+              <w:rPr>
+                <w:rFonts w:ascii="Times New Roman" w:cs="Times New Roman" w:eastAsia="Times New Roman" w:hAnsi="Times New Roman"/>
+              </w:rPr>
+            </w:pPr>
+            <w:r>
+              <w:rPr>
+                <w:rFonts w:ascii="Times New Roman" w:cs="Times New Roman" w:eastAsia="Times New Roman" w:hAnsi="Times New Roman"/>
+                <w:rtl w:val="0"/>
+              </w:rPr>
+              <w:t xml:space="preserve">Allow only admin role to access admin routes </w:t>
+            </w:r>
+          </w:p>
+        </w:tc>
+        <w:tc>
+          <w:tcPr>
+            <w:shd w:fill="auto" w:val="clear"/>
+            <w:tcMar>
+              <w:top w:w="100.0" w:type="dxa"/>
+              <w:left w:w="100.0" w:type="dxa"/>
+              <w:bottom w:w="100.0" w:type="dxa"/>
+              <w:right w:w="100.0" w:type="dxa"/>
+            </w:tcMar>
+            <w:vAlign w:val="top"/>
+          </w:tcPr>
+          <w:p>
+            <w:pPr>
+              <w:keepNext w:val="0"/>
+              <w:keepLines w:val="0"/>
+              <w:pageBreakBefore w:val="0"/>
+              <w:widowControl w:val="0"/>
+              <w:pBdr>
+                <w:top w:space="0" w:sz="0" w:val="nil"/>
+                <w:left w:space="0" w:sz="0" w:val="nil"/>
+                <w:bottom w:space="0" w:sz="0" w:val="nil"/>
+                <w:right w:space="0" w:sz="0" w:val="nil"/>
+                <w:between w:space="0" w:sz="0" w:val="nil"/>
+              </w:pBdr>
+              <w:shd w:fill="auto" w:val="clear"/>
+              <w:spacing w:after="0" w:before="0" w:line="240" w:lineRule="auto"/>
+              <w:ind w:left="0" w:right="0" w:firstLine="0"/>
+              <w:jc w:val="left"/>
+              <w:rPr>
+                <w:rFonts w:ascii="Times New Roman" w:cs="Times New Roman" w:eastAsia="Times New Roman" w:hAnsi="Times New Roman"/>
+              </w:rPr>
+            </w:pPr>
+            <w:r>
+              <w:rPr>
+                <w:rFonts w:ascii="Times New Roman" w:cs="Times New Roman" w:eastAsia="Times New Roman" w:hAnsi="Times New Roman"/>
+                <w:rtl w:val="0"/>
+              </w:rPr>
+              <w:t xml:space="preserve">Send request to admin route using normal user token </w:t>
+            </w:r>
+          </w:p>
+        </w:tc>
+      </w:tr>
+      <w:tr>
+        <w:trPr>
+          <w:cantSplit w:val="0"/>
+          <w:tblHeader w:val="0"/>
+        </w:trPr>
+        <w:tc>
+          <w:tcPr>
+            <w:shd w:fill="auto" w:val="clear"/>
+            <w:tcMar>
+              <w:top w:w="100.0" w:type="dxa"/>
+              <w:left w:w="100.0" w:type="dxa"/>
+              <w:bottom w:w="100.0" w:type="dxa"/>
+              <w:right w:w="100.0" w:type="dxa"/>
+            </w:tcMar>
+            <w:vAlign w:val="top"/>
+          </w:tcPr>
+          <w:p>
+            <w:pPr>
+              <w:keepNext w:val="0"/>
+              <w:keepLines w:val="0"/>
+              <w:pageBreakBefore w:val="0"/>
+              <w:widowControl w:val="0"/>
+              <w:pBdr>
+                <w:top w:space="0" w:sz="0" w:val="nil"/>
+                <w:left w:space="0" w:sz="0" w:val="nil"/>
+                <w:bottom w:space="0" w:sz="0" w:val="nil"/>
+                <w:right w:space="0" w:sz="0" w:val="nil"/>
+                <w:between w:space="0" w:sz="0" w:val="nil"/>
+              </w:pBdr>
+              <w:shd w:fill="auto" w:val="clear"/>
+              <w:spacing w:after="0" w:before="0" w:line="240" w:lineRule="auto"/>
+              <w:ind w:left="0" w:right="0" w:firstLine="0"/>
+              <w:jc w:val="left"/>
+              <w:rPr>
+                <w:rFonts w:ascii="Times New Roman" w:cs="Times New Roman" w:eastAsia="Times New Roman" w:hAnsi="Times New Roman"/>
+              </w:rPr>
+            </w:pPr>
+            <w:r>
+              <w:rPr>
+                <w:rFonts w:ascii="Times New Roman" w:cs="Times New Roman" w:eastAsia="Times New Roman" w:hAnsi="Times New Roman"/>
+                <w:rtl w:val="0"/>
+              </w:rPr>
+              <w:t xml:space="preserve">XSS payload executes in notes </w:t>
+            </w:r>
+          </w:p>
+        </w:tc>
+        <w:tc>
+          <w:tcPr>
+            <w:shd w:fill="auto" w:val="clear"/>
+            <w:tcMar>
+              <w:top w:w="100.0" w:type="dxa"/>
+              <w:left w:w="100.0" w:type="dxa"/>
+              <w:bottom w:w="100.0" w:type="dxa"/>
+              <w:right w:w="100.0" w:type="dxa"/>
+            </w:tcMar>
+            <w:vAlign w:val="top"/>
+          </w:tcPr>
+          <w:p>
+            <w:pPr>
+              <w:keepNext w:val="0"/>
+              <w:keepLines w:val="0"/>
+              <w:pageBreakBefore w:val="0"/>
+              <w:widowControl w:val="0"/>
+              <w:pBdr>
+                <w:top w:space="0" w:sz="0" w:val="nil"/>
+                <w:left w:space="0" w:sz="0" w:val="nil"/>
+                <w:bottom w:space="0" w:sz="0" w:val="nil"/>
+                <w:right w:space="0" w:sz="0" w:val="nil"/>
+                <w:between w:space="0" w:sz="0" w:val="nil"/>
+              </w:pBdr>
+              <w:shd w:fill="auto" w:val="clear"/>
+              <w:spacing w:after="0" w:before="0" w:line="240" w:lineRule="auto"/>
+              <w:ind w:left="0" w:right="0" w:firstLine="0"/>
+              <w:jc w:val="left"/>
+              <w:rPr>
+                <w:rFonts w:ascii="Times New Roman" w:cs="Times New Roman" w:eastAsia="Times New Roman" w:hAnsi="Times New Roman"/>
+              </w:rPr>
+            </w:pPr>
+            <w:r>
+              <w:rPr>
+                <w:rFonts w:ascii="Times New Roman" w:cs="Times New Roman" w:eastAsia="Times New Roman" w:hAnsi="Times New Roman"/>
+                <w:rtl w:val="0"/>
+              </w:rPr>
+              <w:t xml:space="preserve">Frontend renders user input as HTML </w:t>
+            </w:r>
+          </w:p>
+        </w:tc>
+        <w:tc>
+          <w:tcPr>
+            <w:shd w:fill="auto" w:val="clear"/>
+            <w:tcMar>
+              <w:top w:w="100.0" w:type="dxa"/>
+              <w:left w:w="100.0" w:type="dxa"/>
+              <w:bottom w:w="100.0" w:type="dxa"/>
+              <w:right w:w="100.0" w:type="dxa"/>
+            </w:tcMar>
+            <w:vAlign w:val="top"/>
+          </w:tcPr>
+          <w:p>
+            <w:pPr>
+              <w:keepNext w:val="0"/>
+              <w:keepLines w:val="0"/>
+              <w:pageBreakBefore w:val="0"/>
+              <w:widowControl w:val="0"/>
+              <w:pBdr>
+                <w:top w:space="0" w:sz="0" w:val="nil"/>
+                <w:left w:space="0" w:sz="0" w:val="nil"/>
+                <w:bottom w:space="0" w:sz="0" w:val="nil"/>
+                <w:right w:space="0" w:sz="0" w:val="nil"/>
+                <w:between w:space="0" w:sz="0" w:val="nil"/>
+              </w:pBdr>
+              <w:shd w:fill="auto" w:val="clear"/>
+              <w:spacing w:after="0" w:before="0" w:line="240" w:lineRule="auto"/>
+              <w:ind w:left="0" w:right="0" w:firstLine="0"/>
+              <w:jc w:val="left"/>
+              <w:rPr>
+                <w:rFonts w:ascii="Times New Roman" w:cs="Times New Roman" w:eastAsia="Times New Roman" w:hAnsi="Times New Roman"/>
+              </w:rPr>
+            </w:pPr>
+            <w:r>
+              <w:rPr>
+                <w:rFonts w:ascii="Times New Roman" w:cs="Times New Roman" w:eastAsia="Times New Roman" w:hAnsi="Times New Roman"/>
+                <w:rtl w:val="0"/>
+              </w:rPr>
+              <w:t xml:space="preserve">Frontend </w:t>
+            </w:r>
+          </w:p>
+        </w:tc>
+        <w:tc>
+          <w:tcPr>
+            <w:shd w:fill="auto" w:val="clear"/>
+            <w:tcMar>
+              <w:top w:w="100.0" w:type="dxa"/>
+              <w:left w:w="100.0" w:type="dxa"/>
+              <w:bottom w:w="100.0" w:type="dxa"/>
+              <w:right w:w="100.0" w:type="dxa"/>
+            </w:tcMar>
+            <w:vAlign w:val="top"/>
+          </w:tcPr>
+          <w:p>
+            <w:pPr>
+              <w:keepNext w:val="0"/>
+              <w:keepLines w:val="0"/>
+              <w:pageBreakBefore w:val="0"/>
+              <w:widowControl w:val="0"/>
+              <w:pBdr>
+                <w:top w:space="0" w:sz="0" w:val="nil"/>
+                <w:left w:space="0" w:sz="0" w:val="nil"/>
+                <w:bottom w:space="0" w:sz="0" w:val="nil"/>
+                <w:right w:space="0" w:sz="0" w:val="nil"/>
+                <w:between w:space="0" w:sz="0" w:val="nil"/>
+              </w:pBdr>
+              <w:shd w:fill="auto" w:val="clear"/>
+              <w:spacing w:after="0" w:before="0" w:line="240" w:lineRule="auto"/>
+              <w:ind w:left="0" w:right="0" w:firstLine="0"/>
+              <w:jc w:val="left"/>
+              <w:rPr>
+                <w:rFonts w:ascii="Times New Roman" w:cs="Times New Roman" w:eastAsia="Times New Roman" w:hAnsi="Times New Roman"/>
+              </w:rPr>
+            </w:pPr>
+            <w:r>
+              <w:rPr>
+                <w:rFonts w:ascii="Times New Roman" w:cs="Times New Roman" w:eastAsia="Times New Roman" w:hAnsi="Times New Roman"/>
+                <w:rtl w:val="0"/>
+              </w:rPr>
+              <w:t xml:space="preserve">Display user-generated content as text instead of HTML </w:t>
+            </w:r>
+          </w:p>
+        </w:tc>
+        <w:tc>
+          <w:tcPr>
+            <w:shd w:fill="auto" w:val="clear"/>
+            <w:tcMar>
+              <w:top w:w="100.0" w:type="dxa"/>
+              <w:left w:w="100.0" w:type="dxa"/>
+              <w:bottom w:w="100.0" w:type="dxa"/>
+              <w:right w:w="100.0" w:type="dxa"/>
+            </w:tcMar>
+            <w:vAlign w:val="top"/>
+          </w:tcPr>
+          <w:p>
+            <w:pPr>
+              <w:keepNext w:val="0"/>
+              <w:keepLines w:val="0"/>
+              <w:pageBreakBefore w:val="0"/>
+              <w:widowControl w:val="0"/>
+              <w:pBdr>
+                <w:top w:space="0" w:sz="0" w:val="nil"/>
+                <w:left w:space="0" w:sz="0" w:val="nil"/>
+                <w:bottom w:space="0" w:sz="0" w:val="nil"/>
+                <w:right w:space="0" w:sz="0" w:val="nil"/>
+                <w:between w:space="0" w:sz="0" w:val="nil"/>
+              </w:pBdr>
+              <w:shd w:fill="auto" w:val="clear"/>
+              <w:spacing w:after="0" w:before="0" w:line="240" w:lineRule="auto"/>
+              <w:ind w:left="0" w:right="0" w:firstLine="0"/>
+              <w:jc w:val="left"/>
+              <w:rPr>
+                <w:rFonts w:ascii="Times New Roman" w:cs="Times New Roman" w:eastAsia="Times New Roman" w:hAnsi="Times New Roman"/>
+              </w:rPr>
+            </w:pPr>
+            <w:r>
+              <w:rPr>
+                <w:rFonts w:ascii="Times New Roman" w:cs="Times New Roman" w:eastAsia="Times New Roman" w:hAnsi="Times New Roman"/>
+                <w:rtl w:val="0"/>
+              </w:rPr>
+              <w:t xml:space="preserve">Submit XSS payload again and check whether alert executes </w:t>
+            </w:r>
+          </w:p>
+        </w:tc>
+      </w:tr>
+      <w:tr>
+        <w:trPr>
+          <w:cantSplit w:val="0"/>
+          <w:tblHeader w:val="0"/>
+        </w:trPr>
+        <w:tc>
+          <w:tcPr>
+            <w:shd w:fill="auto" w:val="clear"/>
+            <w:tcMar>
+              <w:top w:w="100.0" w:type="dxa"/>
+              <w:left w:w="100.0" w:type="dxa"/>
+              <w:bottom w:w="100.0" w:type="dxa"/>
+              <w:right w:w="100.0" w:type="dxa"/>
+            </w:tcMar>
+            <w:vAlign w:val="top"/>
+          </w:tcPr>
+          <w:p>
+            <w:pPr>
+              <w:keepNext w:val="0"/>
+              <w:keepLines w:val="0"/>
+              <w:pageBreakBefore w:val="0"/>
+              <w:widowControl w:val="0"/>
+              <w:pBdr>
+                <w:top w:space="0" w:sz="0" w:val="nil"/>
+                <w:left w:space="0" w:sz="0" w:val="nil"/>
+                <w:bottom w:space="0" w:sz="0" w:val="nil"/>
+                <w:right w:space="0" w:sz="0" w:val="nil"/>
+                <w:between w:space="0" w:sz="0" w:val="nil"/>
+              </w:pBdr>
+              <w:shd w:fill="auto" w:val="clear"/>
+              <w:spacing w:after="0" w:before="0" w:line="240" w:lineRule="auto"/>
+              <w:ind w:left="0" w:right="0" w:firstLine="0"/>
+              <w:jc w:val="left"/>
+              <w:rPr>
+                <w:rFonts w:ascii="Times New Roman" w:cs="Times New Roman" w:eastAsia="Times New Roman" w:hAnsi="Times New Roman"/>
+              </w:rPr>
+            </w:pPr>
+            <w:r>
+              <w:rPr>
+                <w:rFonts w:ascii="Times New Roman" w:cs="Times New Roman" w:eastAsia="Times New Roman" w:hAnsi="Times New Roman"/>
+                <w:rtl w:val="0"/>
+              </w:rPr>
+              <w:t xml:space="preserve">API response exposes password or password_hash </w:t>
+            </w:r>
+          </w:p>
+        </w:tc>
+        <w:tc>
+          <w:tcPr>
+            <w:shd w:fill="auto" w:val="clear"/>
+            <w:tcMar>
+              <w:top w:w="100.0" w:type="dxa"/>
+              <w:left w:w="100.0" w:type="dxa"/>
+              <w:bottom w:w="100.0" w:type="dxa"/>
+              <w:right w:w="100.0" w:type="dxa"/>
+            </w:tcMar>
+            <w:vAlign w:val="top"/>
+          </w:tcPr>
+          <w:p>
+            <w:pPr>
+              <w:keepNext w:val="0"/>
+              <w:keepLines w:val="0"/>
+              <w:pageBreakBefore w:val="0"/>
+              <w:widowControl w:val="0"/>
+              <w:pBdr>
+                <w:top w:space="0" w:sz="0" w:val="nil"/>
+                <w:left w:space="0" w:sz="0" w:val="nil"/>
+                <w:bottom w:space="0" w:sz="0" w:val="nil"/>
+                <w:right w:space="0" w:sz="0" w:val="nil"/>
+                <w:between w:space="0" w:sz="0" w:val="nil"/>
+              </w:pBdr>
+              <w:shd w:fill="auto" w:val="clear"/>
+              <w:spacing w:after="0" w:before="0" w:line="240" w:lineRule="auto"/>
+              <w:ind w:left="0" w:right="0" w:firstLine="0"/>
+              <w:jc w:val="left"/>
+              <w:rPr>
+                <w:rFonts w:ascii="Times New Roman" w:cs="Times New Roman" w:eastAsia="Times New Roman" w:hAnsi="Times New Roman"/>
+              </w:rPr>
+            </w:pPr>
+            <w:r>
+              <w:rPr>
+                <w:rFonts w:ascii="Times New Roman" w:cs="Times New Roman" w:eastAsia="Times New Roman" w:hAnsi="Times New Roman"/>
+                <w:rtl w:val="0"/>
+              </w:rPr>
+              <w:t xml:space="preserve">API returns sensitive user fields </w:t>
+            </w:r>
+          </w:p>
+        </w:tc>
+        <w:tc>
+          <w:tcPr>
+            <w:shd w:fill="auto" w:val="clear"/>
+            <w:tcMar>
+              <w:top w:w="100.0" w:type="dxa"/>
+              <w:left w:w="100.0" w:type="dxa"/>
+              <w:bottom w:w="100.0" w:type="dxa"/>
+              <w:right w:w="100.0" w:type="dxa"/>
+            </w:tcMar>
+            <w:vAlign w:val="top"/>
+          </w:tcPr>
+          <w:p>
+            <w:pPr>
+              <w:keepNext w:val="0"/>
+              <w:keepLines w:val="0"/>
+              <w:pageBreakBefore w:val="0"/>
+              <w:widowControl w:val="0"/>
+              <w:pBdr>
+                <w:top w:space="0" w:sz="0" w:val="nil"/>
+                <w:left w:space="0" w:sz="0" w:val="nil"/>
+                <w:bottom w:space="0" w:sz="0" w:val="nil"/>
+                <w:right w:space="0" w:sz="0" w:val="nil"/>
+                <w:between w:space="0" w:sz="0" w:val="nil"/>
+              </w:pBdr>
+              <w:shd w:fill="auto" w:val="clear"/>
+              <w:spacing w:after="0" w:before="0" w:line="240" w:lineRule="auto"/>
+              <w:ind w:left="0" w:right="0" w:firstLine="0"/>
+              <w:jc w:val="left"/>
+              <w:rPr>
+                <w:rFonts w:ascii="Times New Roman" w:cs="Times New Roman" w:eastAsia="Times New Roman" w:hAnsi="Times New Roman"/>
+              </w:rPr>
+            </w:pPr>
+            <w:r>
+              <w:rPr>
+                <w:rFonts w:ascii="Times New Roman" w:cs="Times New Roman" w:eastAsia="Times New Roman" w:hAnsi="Times New Roman"/>
+                <w:rtl w:val="0"/>
+              </w:rPr>
+              <w:t xml:space="preserve">Backend API </w:t>
+            </w:r>
+          </w:p>
+        </w:tc>
+        <w:tc>
+          <w:tcPr>
+            <w:shd w:fill="auto" w:val="clear"/>
+            <w:tcMar>
+              <w:top w:w="100.0" w:type="dxa"/>
+              <w:left w:w="100.0" w:type="dxa"/>
+              <w:bottom w:w="100.0" w:type="dxa"/>
+              <w:right w:w="100.0" w:type="dxa"/>
+            </w:tcMar>
+            <w:vAlign w:val="top"/>
+          </w:tcPr>
+          <w:p>
+            <w:pPr>
+              <w:keepNext w:val="0"/>
+              <w:keepLines w:val="0"/>
+              <w:pageBreakBefore w:val="0"/>
+              <w:widowControl w:val="0"/>
+              <w:pBdr>
+                <w:top w:space="0" w:sz="0" w:val="nil"/>
+                <w:left w:space="0" w:sz="0" w:val="nil"/>
+                <w:bottom w:space="0" w:sz="0" w:val="nil"/>
+                <w:right w:space="0" w:sz="0" w:val="nil"/>
+                <w:between w:space="0" w:sz="0" w:val="nil"/>
+              </w:pBdr>
+              <w:shd w:fill="auto" w:val="clear"/>
+              <w:spacing w:after="0" w:before="0" w:line="240" w:lineRule="auto"/>
+              <w:ind w:left="0" w:right="0" w:firstLine="0"/>
+              <w:jc w:val="left"/>
+              <w:rPr>
+                <w:rFonts w:ascii="Times New Roman" w:cs="Times New Roman" w:eastAsia="Times New Roman" w:hAnsi="Times New Roman"/>
+              </w:rPr>
+            </w:pPr>
+            <w:r>
+              <w:rPr>
+                <w:rFonts w:ascii="Times New Roman" w:cs="Times New Roman" w:eastAsia="Times New Roman" w:hAnsi="Times New Roman"/>
+                <w:rtl w:val="0"/>
+              </w:rPr>
+              <w:t xml:space="preserve">Return only necessary fields such as id, name, email, and role </w:t>
+            </w:r>
+          </w:p>
+        </w:tc>
+        <w:tc>
+          <w:tcPr>
+            <w:shd w:fill="auto" w:val="clear"/>
+            <w:tcMar>
+              <w:top w:w="100.0" w:type="dxa"/>
+              <w:left w:w="100.0" w:type="dxa"/>
+              <w:bottom w:w="100.0" w:type="dxa"/>
+              <w:right w:w="100.0" w:type="dxa"/>
+            </w:tcMar>
+            <w:vAlign w:val="top"/>
+          </w:tcPr>
+          <w:p>
+            <w:pPr>
+              <w:keepNext w:val="0"/>
+              <w:keepLines w:val="0"/>
+              <w:pageBreakBefore w:val="0"/>
+              <w:widowControl w:val="0"/>
+              <w:pBdr>
+                <w:top w:space="0" w:sz="0" w:val="nil"/>
+                <w:left w:space="0" w:sz="0" w:val="nil"/>
+                <w:bottom w:space="0" w:sz="0" w:val="nil"/>
+                <w:right w:space="0" w:sz="0" w:val="nil"/>
+                <w:between w:space="0" w:sz="0" w:val="nil"/>
+              </w:pBdr>
+              <w:shd w:fill="auto" w:val="clear"/>
+              <w:spacing w:after="0" w:before="0" w:line="240" w:lineRule="auto"/>
+              <w:ind w:left="0" w:right="0" w:firstLine="0"/>
+              <w:jc w:val="left"/>
+              <w:rPr>
+                <w:rFonts w:ascii="Times New Roman" w:cs="Times New Roman" w:eastAsia="Times New Roman" w:hAnsi="Times New Roman"/>
+              </w:rPr>
+            </w:pPr>
+            <w:r>
+              <w:rPr>
+                <w:rFonts w:ascii="Times New Roman" w:cs="Times New Roman" w:eastAsia="Times New Roman" w:hAnsi="Times New Roman"/>
+                <w:rtl w:val="0"/>
+              </w:rPr>
+              <w:t xml:space="preserve">Check API response again and confirm password fields are removed </w:t>
+            </w:r>
+          </w:p>
+        </w:tc>
+      </w:tr>
+      <w:tr>
+        <w:trPr>
+          <w:cantSplit w:val="0"/>
+          <w:tblHeader w:val="0"/>
+        </w:trPr>
+        <w:tc>
+          <w:tcPr>
+            <w:shd w:fill="auto" w:val="clear"/>
+            <w:tcMar>
+              <w:top w:w="100.0" w:type="dxa"/>
+              <w:left w:w="100.0" w:type="dxa"/>
+              <w:bottom w:w="100.0" w:type="dxa"/>
+              <w:right w:w="100.0" w:type="dxa"/>
+            </w:tcMar>
+            <w:vAlign w:val="top"/>
+          </w:tcPr>
+          <w:p>
+            <w:pPr>
+              <w:keepNext w:val="0"/>
+              <w:keepLines w:val="0"/>
+              <w:pageBreakBefore w:val="0"/>
+              <w:widowControl w:val="0"/>
+              <w:pBdr>
+                <w:top w:space="0" w:sz="0" w:val="nil"/>
+                <w:left w:space="0" w:sz="0" w:val="nil"/>
+                <w:bottom w:space="0" w:sz="0" w:val="nil"/>
+                <w:right w:space="0" w:sz="0" w:val="nil"/>
+                <w:between w:space="0" w:sz="0" w:val="nil"/>
+              </w:pBdr>
+              <w:shd w:fill="auto" w:val="clear"/>
+              <w:spacing w:after="0" w:before="0" w:line="240" w:lineRule="auto"/>
+              <w:ind w:left="0" w:right="0" w:firstLine="0"/>
+              <w:jc w:val="left"/>
+              <w:rPr>
+                <w:rFonts w:ascii="Times New Roman" w:cs="Times New Roman" w:eastAsia="Times New Roman" w:hAnsi="Times New Roman"/>
+              </w:rPr>
+            </w:pPr>
+            <w:r>
+              <w:rPr>
+                <w:rFonts w:ascii="Times New Roman" w:cs="Times New Roman" w:eastAsia="Times New Roman" w:hAnsi="Times New Roman"/>
+                <w:rtl w:val="0"/>
+              </w:rPr>
+              <w:t xml:space="preserve">SQL Injection input may affect query </w:t>
+            </w:r>
+          </w:p>
+        </w:tc>
+        <w:tc>
+          <w:tcPr>
+            <w:shd w:fill="auto" w:val="clear"/>
+            <w:tcMar>
+              <w:top w:w="100.0" w:type="dxa"/>
+              <w:left w:w="100.0" w:type="dxa"/>
+              <w:bottom w:w="100.0" w:type="dxa"/>
+              <w:right w:w="100.0" w:type="dxa"/>
+            </w:tcMar>
+            <w:vAlign w:val="top"/>
+          </w:tcPr>
+          <w:p>
+            <w:pPr>
+              <w:keepNext w:val="0"/>
+              <w:keepLines w:val="0"/>
+              <w:pageBreakBefore w:val="0"/>
+              <w:widowControl w:val="0"/>
+              <w:pBdr>
+                <w:top w:space="0" w:sz="0" w:val="nil"/>
+                <w:left w:space="0" w:sz="0" w:val="nil"/>
+                <w:bottom w:space="0" w:sz="0" w:val="nil"/>
+                <w:right w:space="0" w:sz="0" w:val="nil"/>
+                <w:between w:space="0" w:sz="0" w:val="nil"/>
+              </w:pBdr>
+              <w:shd w:fill="auto" w:val="clear"/>
+              <w:spacing w:after="0" w:before="0" w:line="240" w:lineRule="auto"/>
+              <w:ind w:left="0" w:right="0" w:firstLine="0"/>
+              <w:jc w:val="left"/>
+              <w:rPr>
+                <w:rFonts w:ascii="Times New Roman" w:cs="Times New Roman" w:eastAsia="Times New Roman" w:hAnsi="Times New Roman"/>
+              </w:rPr>
+            </w:pPr>
+            <w:r>
+              <w:rPr>
+                <w:rFonts w:ascii="Times New Roman" w:cs="Times New Roman" w:eastAsia="Times New Roman" w:hAnsi="Times New Roman"/>
+                <w:rtl w:val="0"/>
+              </w:rPr>
+              <w:t xml:space="preserve">SQL query uses string concatenation </w:t>
+            </w:r>
+          </w:p>
+        </w:tc>
+        <w:tc>
+          <w:tcPr>
+            <w:shd w:fill="auto" w:val="clear"/>
+            <w:tcMar>
+              <w:top w:w="100.0" w:type="dxa"/>
+              <w:left w:w="100.0" w:type="dxa"/>
+              <w:bottom w:w="100.0" w:type="dxa"/>
+              <w:right w:w="100.0" w:type="dxa"/>
+            </w:tcMar>
+            <w:vAlign w:val="top"/>
+          </w:tcPr>
+          <w:p>
+            <w:pPr>
+              <w:keepNext w:val="0"/>
+              <w:keepLines w:val="0"/>
+              <w:pageBreakBefore w:val="0"/>
+              <w:widowControl w:val="0"/>
+              <w:pBdr>
+                <w:top w:space="0" w:sz="0" w:val="nil"/>
+                <w:left w:space="0" w:sz="0" w:val="nil"/>
+                <w:bottom w:space="0" w:sz="0" w:val="nil"/>
+                <w:right w:space="0" w:sz="0" w:val="nil"/>
+                <w:between w:space="0" w:sz="0" w:val="nil"/>
+              </w:pBdr>
+              <w:shd w:fill="auto" w:val="clear"/>
+              <w:spacing w:after="0" w:before="0" w:line="240" w:lineRule="auto"/>
+              <w:ind w:left="0" w:right="0" w:firstLine="0"/>
+              <w:jc w:val="left"/>
+              <w:rPr>
+                <w:rFonts w:ascii="Times New Roman" w:cs="Times New Roman" w:eastAsia="Times New Roman" w:hAnsi="Times New Roman"/>
+              </w:rPr>
+            </w:pPr>
+            <w:r>
+              <w:rPr>
+                <w:rFonts w:ascii="Times New Roman" w:cs="Times New Roman" w:eastAsia="Times New Roman" w:hAnsi="Times New Roman"/>
+                <w:rtl w:val="0"/>
+              </w:rPr>
+              <w:t xml:space="preserve">Backend / Database </w:t>
+            </w:r>
+          </w:p>
+        </w:tc>
+        <w:tc>
+          <w:tcPr>
+            <w:shd w:fill="auto" w:val="clear"/>
+            <w:tcMar>
+              <w:top w:w="100.0" w:type="dxa"/>
+              <w:left w:w="100.0" w:type="dxa"/>
+              <w:bottom w:w="100.0" w:type="dxa"/>
+              <w:right w:w="100.0" w:type="dxa"/>
+            </w:tcMar>
+            <w:vAlign w:val="top"/>
+          </w:tcPr>
+          <w:p>
+            <w:pPr>
+              <w:keepNext w:val="0"/>
+              <w:keepLines w:val="0"/>
+              <w:pageBreakBefore w:val="0"/>
+              <w:widowControl w:val="0"/>
+              <w:pBdr>
+                <w:top w:space="0" w:sz="0" w:val="nil"/>
+                <w:left w:space="0" w:sz="0" w:val="nil"/>
+                <w:bottom w:space="0" w:sz="0" w:val="nil"/>
+                <w:right w:space="0" w:sz="0" w:val="nil"/>
+                <w:between w:space="0" w:sz="0" w:val="nil"/>
+              </w:pBdr>
+              <w:shd w:fill="auto" w:val="clear"/>
+              <w:spacing w:after="0" w:before="0" w:line="240" w:lineRule="auto"/>
+              <w:ind w:left="0" w:right="0" w:firstLine="0"/>
+              <w:jc w:val="left"/>
+              <w:rPr>
+                <w:rFonts w:ascii="Times New Roman" w:cs="Times New Roman" w:eastAsia="Times New Roman" w:hAnsi="Times New Roman"/>
+              </w:rPr>
+            </w:pPr>
+            <w:r>
+              <w:rPr>
+                <w:rFonts w:ascii="Times New Roman" w:cs="Times New Roman" w:eastAsia="Times New Roman" w:hAnsi="Times New Roman"/>
+                <w:rtl w:val="0"/>
+              </w:rPr>
+              <w:t xml:space="preserve">Use prepared statements for database queries </w:t>
+            </w:r>
+          </w:p>
+        </w:tc>
+        <w:tc>
+          <w:tcPr>
+            <w:shd w:fill="auto" w:val="clear"/>
+            <w:tcMar>
+              <w:top w:w="100.0" w:type="dxa"/>
+              <w:left w:w="100.0" w:type="dxa"/>
+              <w:bottom w:w="100.0" w:type="dxa"/>
+              <w:right w:w="100.0" w:type="dxa"/>
+            </w:tcMar>
+            <w:vAlign w:val="top"/>
+          </w:tcPr>
+          <w:p>
+            <w:pPr>
+              <w:keepNext w:val="0"/>
+              <w:keepLines w:val="0"/>
+              <w:pageBreakBefore w:val="0"/>
+              <w:widowControl w:val="0"/>
+              <w:pBdr>
+                <w:top w:space="0" w:sz="0" w:val="nil"/>
+                <w:left w:space="0" w:sz="0" w:val="nil"/>
+                <w:bottom w:space="0" w:sz="0" w:val="nil"/>
+                <w:right w:space="0" w:sz="0" w:val="nil"/>
+                <w:between w:space="0" w:sz="0" w:val="nil"/>
+              </w:pBdr>
+              <w:shd w:fill="auto" w:val="clear"/>
+              <w:spacing w:after="0" w:before="0" w:line="240" w:lineRule="auto"/>
+              <w:ind w:left="0" w:right="0" w:firstLine="0"/>
+              <w:jc w:val="left"/>
+              <w:rPr>
+                <w:rFonts w:ascii="Times New Roman" w:cs="Times New Roman" w:eastAsia="Times New Roman" w:hAnsi="Times New Roman"/>
+              </w:rPr>
+            </w:pPr>
+            <w:r>
+              <w:rPr>
+                <w:rFonts w:ascii="Times New Roman" w:cs="Times New Roman" w:eastAsia="Times New Roman" w:hAnsi="Times New Roman"/>
+                <w:rtl w:val="0"/>
+              </w:rPr>
+              <w:t xml:space="preserve">Try SQL Injection input again in login or search field </w:t>
+            </w:r>
+          </w:p>
+        </w:tc>
+      </w:tr>
+      <w:tr>
+        <w:trPr>
+          <w:cantSplit w:val="0"/>
+          <w:tblHeader w:val="0"/>
+        </w:trPr>
+        <w:tc>
+          <w:tcPr>
+            <w:shd w:fill="auto" w:val="clear"/>
+            <w:tcMar>
+              <w:top w:w="100.0" w:type="dxa"/>
+              <w:left w:w="100.0" w:type="dxa"/>
+              <w:bottom w:w="100.0" w:type="dxa"/>
+              <w:right w:w="100.0" w:type="dxa"/>
+            </w:tcMar>
+            <w:vAlign w:val="top"/>
+          </w:tcPr>
+          <w:p>
+            <w:pPr>
+              <w:keepNext w:val="0"/>
+              <w:keepLines w:val="0"/>
+              <w:pageBreakBefore w:val="0"/>
+              <w:widowControl w:val="0"/>
+              <w:pBdr>
+                <w:top w:space="0" w:sz="0" w:val="nil"/>
+                <w:left w:space="0" w:sz="0" w:val="nil"/>
+                <w:bottom w:space="0" w:sz="0" w:val="nil"/>
+                <w:right w:space="0" w:sz="0" w:val="nil"/>
+                <w:between w:space="0" w:sz="0" w:val="nil"/>
+              </w:pBdr>
+              <w:shd w:fill="auto" w:val="clear"/>
+              <w:spacing w:after="0" w:before="0" w:line="240" w:lineRule="auto"/>
+              <w:ind w:left="0" w:right="0" w:firstLine="0"/>
+              <w:jc w:val="left"/>
+              <w:rPr>
+                <w:rFonts w:ascii="Times New Roman" w:cs="Times New Roman" w:eastAsia="Times New Roman" w:hAnsi="Times New Roman"/>
+              </w:rPr>
+            </w:pPr>
+            <w:r>
+              <w:rPr>
+                <w:rFonts w:ascii="Times New Roman" w:cs="Times New Roman" w:eastAsia="Times New Roman" w:hAnsi="Times New Roman"/>
+                <w:rtl w:val="0"/>
+              </w:rPr>
+              <w:t xml:space="preserve">User can update protected fields </w:t>
+            </w:r>
+          </w:p>
+        </w:tc>
+        <w:tc>
+          <w:tcPr>
+            <w:shd w:fill="auto" w:val="clear"/>
+            <w:tcMar>
+              <w:top w:w="100.0" w:type="dxa"/>
+              <w:left w:w="100.0" w:type="dxa"/>
+              <w:bottom w:w="100.0" w:type="dxa"/>
+              <w:right w:w="100.0" w:type="dxa"/>
+            </w:tcMar>
+            <w:vAlign w:val="top"/>
+          </w:tcPr>
+          <w:p>
+            <w:pPr>
+              <w:keepNext w:val="0"/>
+              <w:keepLines w:val="0"/>
+              <w:pageBreakBefore w:val="0"/>
+              <w:widowControl w:val="0"/>
+              <w:pBdr>
+                <w:top w:space="0" w:sz="0" w:val="nil"/>
+                <w:left w:space="0" w:sz="0" w:val="nil"/>
+                <w:bottom w:space="0" w:sz="0" w:val="nil"/>
+                <w:right w:space="0" w:sz="0" w:val="nil"/>
+                <w:between w:space="0" w:sz="0" w:val="nil"/>
+              </w:pBdr>
+              <w:shd w:fill="auto" w:val="clear"/>
+              <w:spacing w:after="0" w:before="0" w:line="240" w:lineRule="auto"/>
+              <w:ind w:left="0" w:right="0" w:firstLine="0"/>
+              <w:jc w:val="left"/>
+              <w:rPr>
+                <w:rFonts w:ascii="Times New Roman" w:cs="Times New Roman" w:eastAsia="Times New Roman" w:hAnsi="Times New Roman"/>
+              </w:rPr>
+            </w:pPr>
+            <w:r>
+              <w:rPr>
+                <w:rFonts w:ascii="Times New Roman" w:cs="Times New Roman" w:eastAsia="Times New Roman" w:hAnsi="Times New Roman"/>
+                <w:rtl w:val="0"/>
+              </w:rPr>
+              <w:t xml:space="preserve">Backend accepts fields directly from request body </w:t>
+            </w:r>
+          </w:p>
+        </w:tc>
+        <w:tc>
+          <w:tcPr>
+            <w:shd w:fill="auto" w:val="clear"/>
+            <w:tcMar>
+              <w:top w:w="100.0" w:type="dxa"/>
+              <w:left w:w="100.0" w:type="dxa"/>
+              <w:bottom w:w="100.0" w:type="dxa"/>
+              <w:right w:w="100.0" w:type="dxa"/>
+            </w:tcMar>
+            <w:vAlign w:val="top"/>
+          </w:tcPr>
+          <w:p>
+            <w:pPr>
+              <w:keepNext w:val="0"/>
+              <w:keepLines w:val="0"/>
+              <w:pageBreakBefore w:val="0"/>
+              <w:widowControl w:val="0"/>
+              <w:pBdr>
+                <w:top w:space="0" w:sz="0" w:val="nil"/>
+                <w:left w:space="0" w:sz="0" w:val="nil"/>
+                <w:bottom w:space="0" w:sz="0" w:val="nil"/>
+                <w:right w:space="0" w:sz="0" w:val="nil"/>
+                <w:between w:space="0" w:sz="0" w:val="nil"/>
+              </w:pBdr>
+              <w:shd w:fill="auto" w:val="clear"/>
+              <w:spacing w:after="0" w:before="0" w:line="240" w:lineRule="auto"/>
+              <w:ind w:left="0" w:right="0" w:firstLine="0"/>
+              <w:jc w:val="left"/>
+              <w:rPr>
+                <w:rFonts w:ascii="Times New Roman" w:cs="Times New Roman" w:eastAsia="Times New Roman" w:hAnsi="Times New Roman"/>
+              </w:rPr>
+            </w:pPr>
+            <w:r>
+              <w:rPr>
+                <w:rFonts w:ascii="Times New Roman" w:cs="Times New Roman" w:eastAsia="Times New Roman" w:hAnsi="Times New Roman"/>
+                <w:rtl w:val="0"/>
+              </w:rPr>
+              <w:t xml:space="preserve">Backend API </w:t>
+            </w:r>
+          </w:p>
+        </w:tc>
+        <w:tc>
+          <w:tcPr>
+            <w:shd w:fill="auto" w:val="clear"/>
+            <w:tcMar>
+              <w:top w:w="100.0" w:type="dxa"/>
+              <w:left w:w="100.0" w:type="dxa"/>
+              <w:bottom w:w="100.0" w:type="dxa"/>
+              <w:right w:w="100.0" w:type="dxa"/>
+            </w:tcMar>
+            <w:vAlign w:val="top"/>
+          </w:tcPr>
+          <w:p>
+            <w:pPr>
+              <w:keepNext w:val="0"/>
+              <w:keepLines w:val="0"/>
+              <w:pageBreakBefore w:val="0"/>
+              <w:widowControl w:val="0"/>
+              <w:pBdr>
+                <w:top w:space="0" w:sz="0" w:val="nil"/>
+                <w:left w:space="0" w:sz="0" w:val="nil"/>
+                <w:bottom w:space="0" w:sz="0" w:val="nil"/>
+                <w:right w:space="0" w:sz="0" w:val="nil"/>
+                <w:between w:space="0" w:sz="0" w:val="nil"/>
+              </w:pBdr>
+              <w:shd w:fill="auto" w:val="clear"/>
+              <w:spacing w:after="0" w:before="0" w:line="240" w:lineRule="auto"/>
+              <w:ind w:left="0" w:right="0" w:firstLine="0"/>
+              <w:jc w:val="left"/>
+              <w:rPr>
+                <w:rFonts w:ascii="Times New Roman" w:cs="Times New Roman" w:eastAsia="Times New Roman" w:hAnsi="Times New Roman"/>
+              </w:rPr>
+            </w:pPr>
+            <w:r>
+              <w:rPr>
+                <w:rFonts w:ascii="Times New Roman" w:cs="Times New Roman" w:eastAsia="Times New Roman" w:hAnsi="Times New Roman"/>
+                <w:rtl w:val="0"/>
+              </w:rPr>
+              <w:t xml:space="preserve">Allow only safe fields such as name, age, height, weight, and notes </w:t>
+            </w:r>
+          </w:p>
+        </w:tc>
+        <w:tc>
+          <w:tcPr>
+            <w:shd w:fill="auto" w:val="clear"/>
+            <w:tcMar>
+              <w:top w:w="100.0" w:type="dxa"/>
+              <w:left w:w="100.0" w:type="dxa"/>
+              <w:bottom w:w="100.0" w:type="dxa"/>
+              <w:right w:w="100.0" w:type="dxa"/>
+            </w:tcMar>
+            <w:vAlign w:val="top"/>
+          </w:tcPr>
+          <w:p>
+            <w:pPr>
+              <w:keepNext w:val="0"/>
+              <w:keepLines w:val="0"/>
+              <w:pageBreakBefore w:val="0"/>
+              <w:widowControl w:val="0"/>
+              <w:pBdr>
+                <w:top w:space="0" w:sz="0" w:val="nil"/>
+                <w:left w:space="0" w:sz="0" w:val="nil"/>
+                <w:bottom w:space="0" w:sz="0" w:val="nil"/>
+                <w:right w:space="0" w:sz="0" w:val="nil"/>
+                <w:between w:space="0" w:sz="0" w:val="nil"/>
+              </w:pBdr>
+              <w:shd w:fill="auto" w:val="clear"/>
+              <w:spacing w:after="0" w:before="0" w:line="240" w:lineRule="auto"/>
+              <w:ind w:left="0" w:right="0" w:firstLine="0"/>
+              <w:jc w:val="left"/>
+              <w:rPr>
+                <w:rFonts w:ascii="Times New Roman" w:cs="Times New Roman" w:eastAsia="Times New Roman" w:hAnsi="Times New Roman"/>
+              </w:rPr>
+            </w:pPr>
+            <w:r>
+              <w:rPr>
+                <w:rFonts w:ascii="Times New Roman" w:cs="Times New Roman" w:eastAsia="Times New Roman" w:hAnsi="Times New Roman"/>
+                <w:rtl w:val="0"/>
+              </w:rPr>
+              <w:t xml:space="preserve">Send update request with user_id, role, bmi, or category again </w:t>
             </w:r>
           </w:p>
         </w:tc>
@@ -6384,6 +8471,13 @@
     </w:tblPr>
   </w:style>
   <w:style w:type="table" w:styleId="Table4">
+    <w:basedOn w:val="TableNormal"/>
+    <w:tblPr>
+      <w:tblStyleRowBandSize w:val="1"/>
+      <w:tblStyleColBandSize w:val="1"/>
+    </w:tblPr>
+  </w:style>
+  <w:style w:type="table" w:styleId="Table5">
     <w:basedOn w:val="TableNormal"/>
     <w:tblPr>
       <w:tblStyleRowBandSize w:val="1"/>

</xml_diff>